<commit_message>
docs(huong-dan): drop the warning emoji from the data-entry guides
Use plain text for the callouts so the guides follow the no-emoji
convention, and rebuild the Excel guide document to match.

Also ignore the TypeScript incremental build info file.
</commit_message>
<xml_diff>
--- a/docs/huong-dan/nhap-lieu-bang-excel/Huong-dan-nhap-lieu-bang-Excel.docx
+++ b/docs/huong-dan/nhap-lieu-bang-excel/Huong-dan-nhap-lieu-bang-Excel.docx
@@ -1,14 +1,14 @@
 
 <file path=word/document.xml><?xml version="1.0" encoding="utf-8"?>
-<w:document xmlns:wpc="http://schemas.microsoft.com/office/word/2010/wordprocessingCanvas" xmlns:mc="http://schemas.openxmlformats.org/markup-compatibility/2006" xmlns:o="urn:schemas-microsoft-com:office:office" xmlns:r="http://schemas.openxmlformats.org/officeDocument/2006/relationships" xmlns:m="http://schemas.openxmlformats.org/officeDocument/2006/math" xmlns:v="urn:schemas-microsoft-com:vml" xmlns:wp14="http://schemas.microsoft.com/office/word/2010/wordprocessingDrawing" xmlns:wp="http://schemas.openxmlformats.org/drawingml/2006/wordprocessingDrawing" xmlns:w10="urn:schemas-microsoft-com:office:word" xmlns:w="http://schemas.openxmlformats.org/wordprocessingml/2006/main" xmlns:w14="http://schemas.microsoft.com/office/word/2010/wordml" xmlns:w15="http://schemas.microsoft.com/office/word/2012/wordml" xmlns:wpg="http://schemas.microsoft.com/office/word/2010/wordprocessingGroup" xmlns:wpi="http://schemas.microsoft.com/office/word/2010/wordprocessingInk" xmlns:wne="http://schemas.microsoft.com/office/word/2006/wordml" xmlns:wps="http://schemas.microsoft.com/office/word/2010/wordprocessingShape" xmlns:cx="http://schemas.microsoft.com/office/drawing/2014/chartex" xmlns:cx1="http://schemas.microsoft.com/office/drawing/2015/9/8/chartex" xmlns:cx2="http://schemas.microsoft.com/office/drawing/2015/10/21/chartex" xmlns:cx3="http://schemas.microsoft.com/office/drawing/2016/5/9/chartex" xmlns:cx4="http://schemas.microsoft.com/office/drawing/2016/5/10/chartex" xmlns:cx5="http://schemas.microsoft.com/office/drawing/2016/5/11/chartex" xmlns:cx6="http://schemas.microsoft.com/office/drawing/2016/5/12/chartex" xmlns:cx7="http://schemas.microsoft.com/office/drawing/2016/5/13/chartex" xmlns:cx8="http://schemas.microsoft.com/office/drawing/2016/5/14/chartex" xmlns:aink="http://schemas.microsoft.com/office/drawing/2016/ink" xmlns:am3d="http://schemas.microsoft.com/office/drawing/2017/model3d" xmlns:w16cex="http://schemas.microsoft.com/office/word/2018/wordml/cex" xmlns:w16cid="http://schemas.microsoft.com/office/word/2016/wordml/cid" xmlns:w16="http://schemas.microsoft.com/office/word/2018/wordml" xmlns:w16sdtdh="http://schemas.microsoft.com/office/word/2020/wordml/sdtdatahash" xmlns:w16se="http://schemas.microsoft.com/office/word/2015/wordml/symex" mc:Ignorable="w14 w15 wp14">
+<w:document xmlns:wpc="http://schemas.microsoft.com/office/word/2010/wordprocessingCanvas" xmlns:cx="http://schemas.microsoft.com/office/drawing/2014/chartex" xmlns:cx1="http://schemas.microsoft.com/office/drawing/2015/9/8/chartex" xmlns:cx2="http://schemas.microsoft.com/office/drawing/2015/10/21/chartex" xmlns:cx3="http://schemas.microsoft.com/office/drawing/2016/5/9/chartex" xmlns:cx4="http://schemas.microsoft.com/office/drawing/2016/5/10/chartex" xmlns:cx5="http://schemas.microsoft.com/office/drawing/2016/5/11/chartex" xmlns:cx6="http://schemas.microsoft.com/office/drawing/2016/5/12/chartex" xmlns:cx7="http://schemas.microsoft.com/office/drawing/2016/5/13/chartex" xmlns:cx8="http://schemas.microsoft.com/office/drawing/2016/5/14/chartex" xmlns:mc="http://schemas.openxmlformats.org/markup-compatibility/2006" xmlns:aink="http://schemas.microsoft.com/office/drawing/2016/ink" xmlns:am3d="http://schemas.microsoft.com/office/drawing/2017/model3d" xmlns:o="urn:schemas-microsoft-com:office:office" xmlns:oel="http://schemas.microsoft.com/office/2019/extlst" xmlns:r="http://schemas.openxmlformats.org/officeDocument/2006/relationships" xmlns:m="http://schemas.openxmlformats.org/officeDocument/2006/math" xmlns:v="urn:schemas-microsoft-com:vml" xmlns:wp14="http://schemas.microsoft.com/office/word/2010/wordprocessingDrawing" xmlns:wp="http://schemas.openxmlformats.org/drawingml/2006/wordprocessingDrawing" xmlns:w10="urn:schemas-microsoft-com:office:word" xmlns:w="http://schemas.openxmlformats.org/wordprocessingml/2006/main" xmlns:w14="http://schemas.microsoft.com/office/word/2010/wordml" xmlns:w15="http://schemas.microsoft.com/office/word/2012/wordml" xmlns:w16cex="http://schemas.microsoft.com/office/word/2018/wordml/cex" xmlns:w16cid="http://schemas.microsoft.com/office/word/2016/wordml/cid" xmlns:w16="http://schemas.microsoft.com/office/word/2018/wordml" xmlns:w16du="http://schemas.microsoft.com/office/word/2023/wordml/word16du" xmlns:w16sdtdh="http://schemas.microsoft.com/office/word/2020/wordml/sdtdatahash" xmlns:w16sdtfl="http://schemas.microsoft.com/office/word/2024/wordml/sdtformatlock" xmlns:w16se="http://schemas.microsoft.com/office/word/2015/wordml/symex" xmlns:wpg="http://schemas.microsoft.com/office/word/2010/wordprocessingGroup" xmlns:wpi="http://schemas.microsoft.com/office/word/2010/wordprocessingInk" xmlns:wne="http://schemas.microsoft.com/office/word/2006/wordml" xmlns:wps="http://schemas.microsoft.com/office/word/2010/wordprocessingShape" mc:Ignorable="w14 w15 w16se w16cid w16 w16cex w16sdtdh w16sdtfl w16du wp14">
   <w:body>
     <w:p>
       <w:pPr>
         <w:pStyle w:val="Heading1"/>
-        <w:spacing w:after="80" w:before="80"/>
-      </w:pPr>
-      <w:r>
-        <w:t xml:space="preserve">Hướng dẫn nhập liệu bằng Excel</w:t>
+        <w:spacing w:before="80" w:after="80"/>
+      </w:pPr>
+      <w:r>
+        <w:t>Hướng dẫn nhập liệu bằng Excel</w:t>
       </w:r>
     </w:p>
     <w:p>
@@ -16,7 +16,7 @@
         <w:spacing w:after="200"/>
       </w:pPr>
       <w:r>
-        <w:t xml:space="preserve">Thay vì gõ tay từng ngày trên web, có thể tải file Excel mẫu về điền rồi nhập lên. Tài liệu này mô tả ba biểu mẫu — Thu mua, Tiêu thụ, Tồn kho — kèm ý nghĩa từng cột và cách xử lý dòng lỗi. Ba file mẫu đính kèm trong thư mục 'mau'. Tài liệu bám theo phiên bản 0.2.75.</w:t>
+        <w:t>Thay vì gõ tay từng ngày trên web, có thể tải file Excel mẫu về điền rồi nhập lên. Tài liệu này mô tả ba biểu mẫu — Thu mua, Tiêu thụ, Tồn kho — kèm ý nghĩa từng cột và cách xử lý dòng lỗi. Ba file mẫu đính kèm trong thư mục 'mau'. Tài liệu bám theo phiên bản 0.2.75.</w:t>
       </w:r>
     </w:p>
     <w:p>
@@ -24,7 +24,7 @@
         <w:pStyle w:val="Heading2"/>
       </w:pPr>
       <w:r>
-        <w:t xml:space="preserve">1. Quy trình chung — bốn bước</w:t>
+        <w:t>1. Quy trình chung — bốn bước</w:t>
       </w:r>
     </w:p>
     <w:p>
@@ -39,7 +39,7 @@
         <w:t xml:space="preserve">Vị trí: </w:t>
       </w:r>
       <w:r>
-        <w:t xml:space="preserve">Màn Báo cáo thu mua / Báo cáo tiêu thụ / Báo cáo tồn kho / Kế hoạch năm</w:t>
+        <w:t>Màn Báo cáo thu mua / Báo cáo tiêu thụ / Báo cáo tồn kho / Kế hoạch năm</w:t>
       </w:r>
     </w:p>
     <w:p>
@@ -47,19 +47,22 @@
         <w:spacing w:after="140"/>
       </w:pPr>
       <w:r>
-        <w:t xml:space="preserve">Bốn màn báo cáo đều có cùng hai nút ở đầu trang. Quy trình giống nhau cho cả ba biểu mẫu: tải mẫu về, điền số, nhập lên xem trước, rồi mới xác nhận ghi.</w:t>
-      </w:r>
-    </w:p>
-    <w:p>
-      <w:pPr>
-        <w:spacing w:after="60" w:before="60"/>
+        <w:t>Bốn màn báo cáo đều có cùng hai nút ở đầu trang. Quy trình giống nhau cho cả ba biểu mẫu: tải mẫu về, điền số, nhập lên xem trước, rồi mới xác nhận ghi.</w:t>
+      </w:r>
+    </w:p>
+    <w:p>
+      <w:pPr>
+        <w:spacing w:before="60" w:after="60"/>
         <w:jc w:val="center"/>
       </w:pPr>
       <w:r>
+        <w:rPr>
+          <w:noProof/>
+        </w:rPr>
         <w:drawing>
-          <wp:inline distT="0" distB="0" distL="0" distR="0">
+          <wp:inline distT="0" distB="0" distL="0" distR="0" wp14:anchorId="126687C9" wp14:editId="0273E1D8">
             <wp:extent cx="6191250" cy="3924300"/>
-            <wp:effectExtent t="0" r="0" b="0" l="0"/>
+            <wp:effectExtent l="0" t="0" r="0" b="0"/>
             <wp:docPr id="1" name="img" descr="Ảnh hướng dẫn có đánh số bước" title="img/01-thanh-nut.png"/>
             <wp:cNvGraphicFramePr>
               <a:graphicFrameLocks xmlns:a="http://schemas.openxmlformats.org/drawingml/2006/main" noChangeAspect="1"/>
@@ -68,13 +71,13 @@
               <a:graphicData uri="http://schemas.openxmlformats.org/drawingml/2006/picture">
                 <pic:pic xmlns:pic="http://schemas.openxmlformats.org/drawingml/2006/picture">
                   <pic:nvPicPr>
-                    <pic:cNvPr id="0" name="" descr=""/>
+                    <pic:cNvPr id="0" name=""/>
                     <pic:cNvPicPr>
                       <a:picLocks noChangeAspect="1" noChangeArrowheads="1"/>
                     </pic:cNvPicPr>
                   </pic:nvPicPr>
                   <pic:blipFill>
-                    <a:blip r:embed="rId8" cstate="none"/>
+                    <a:blip r:embed="rId7"/>
                     <a:srcRect/>
                     <a:stretch>
                       <a:fillRect/>
@@ -109,7 +112,7 @@
           <w:sz w:val="17"/>
           <w:szCs w:val="17"/>
         </w:rPr>
-        <w:t xml:space="preserve">Hình 1. Hai nút Tải mẫu Excel và Nhập từ Excel</w:t>
+        <w:t>Hình 1. Hai nút Tải mẫu Excel và Nhập từ Excel</w:t>
       </w:r>
     </w:p>
     <w:p>
@@ -121,7 +124,7 @@
           <w:b/>
           <w:bCs/>
         </w:rPr>
-        <w:t xml:space="preserve">Các bước:</w:t>
+        <w:t>Các bước:</w:t>
       </w:r>
     </w:p>
     <w:p>
@@ -138,7 +141,7 @@
           <w:b/>
           <w:bCs/>
         </w:rPr>
-        <w:t xml:space="preserve">Tải mẫu Excel</w:t>
+        <w:t>Tải mẫu Excel</w:t>
       </w:r>
       <w:r>
         <w:t xml:space="preserve"> — luôn tải mẫu MỚI từ nút này trước khi điền.</w:t>
@@ -161,7 +164,7 @@
           <w:b/>
           <w:bCs/>
         </w:rPr>
-        <w:t xml:space="preserve">Không đổi tên cột, không xoá dòng tiêu đề</w:t>
+        <w:t>Không đổi tên cột, không xoá dòng tiêu đề</w:t>
       </w:r>
       <w:r>
         <w:t xml:space="preserve"> — hệ thống dò cột theo đúng tên tiêu đề.</w:t>
@@ -181,7 +184,7 @@
           <w:b/>
           <w:bCs/>
         </w:rPr>
-        <w:t xml:space="preserve">Nhập từ Excel</w:t>
+        <w:t>Nhập từ Excel</w:t>
       </w:r>
       <w:r>
         <w:t xml:space="preserve"> → chọn file đã điền. Hệ thống đọc file và mở bảng </w:t>
@@ -191,7 +194,7 @@
           <w:b/>
           <w:bCs/>
         </w:rPr>
-        <w:t xml:space="preserve">xem trước</w:t>
+        <w:t>xem trước</w:t>
       </w:r>
       <w:r>
         <w:t xml:space="preserve"> (chưa ghi gì cả).</w:t>
@@ -214,7 +217,7 @@
           <w:b/>
           <w:bCs/>
         </w:rPr>
-        <w:t xml:space="preserve">Xác nhận ghi</w:t>
+        <w:t>Xác nhận ghi</w:t>
       </w:r>
       <w:r>
         <w:t xml:space="preserve"> — chỉ khi đó số liệu mới vào hệ thống.</w:t>
@@ -222,14 +225,14 @@
     </w:p>
     <w:p>
       <w:pPr>
-        <w:spacing w:after="80" w:before="140"/>
-      </w:pPr>
-      <w:r>
-        <w:rPr>
-          <w:b/>
-          <w:bCs/>
-        </w:rPr>
-        <w:t xml:space="preserve">Lưu ý:</w:t>
+        <w:spacing w:before="140" w:after="80"/>
+      </w:pPr>
+      <w:r>
+        <w:rPr>
+          <w:b/>
+          <w:bCs/>
+        </w:rPr>
+        <w:t>Lưu ý:</w:t>
       </w:r>
     </w:p>
     <w:p>
@@ -246,7 +249,7 @@
           <w:b/>
           <w:bCs/>
         </w:rPr>
-        <w:t xml:space="preserve">Đừng dùng lại file tải từ lần trước</w:t>
+        <w:t>Đừng dùng lại file tải từ lần trước</w:t>
       </w:r>
       <w:r>
         <w:t xml:space="preserve"> — mẫu có thể đã thêm cột; file cũ thiếu cột sẽ nhập thiếu số mà không báo gì.</w:t>
@@ -269,7 +272,7 @@
           <w:b/>
           <w:bCs/>
         </w:rPr>
-        <w:t xml:space="preserve">File chuẩn luôn là file tải từ nút Tải mẫu Excel</w:t>
+        <w:t>File chuẩn luôn là file tải từ nút Tải mẫu Excel</w:t>
       </w:r>
       <w:r>
         <w:t xml:space="preserve"> trên hệ thống.</w:t>
@@ -292,7 +295,7 @@
           <w:b/>
           <w:bCs/>
         </w:rPr>
-        <w:t xml:space="preserve">không có cột 'Đơn vị'</w:t>
+        <w:t>không có cột 'Đơn vị'</w:t>
       </w:r>
       <w:r>
         <w:t xml:space="preserve"> — hệ thống tự gán đúng đơn vị của tài khoản. Tài khoản chuyên viên thì có cột này và phải điền tên đơn vị đúng như trong danh mục.</w:t>
@@ -308,6 +311,7 @@
         <w:spacing w:after="80"/>
       </w:pPr>
       <w:r>
+        <w:lastRenderedPageBreak/>
         <w:t xml:space="preserve">Dữ liệu bắt đầu từ </w:t>
       </w:r>
       <w:r>
@@ -315,7 +319,7 @@
           <w:b/>
           <w:bCs/>
         </w:rPr>
-        <w:t xml:space="preserve">dòng 7</w:t>
+        <w:t>dòng 7</w:t>
       </w:r>
       <w:r>
         <w:t xml:space="preserve"> của file mẫu (dòng 5 là tiêu đề, dòng 6 là đơn vị tính). Điền từ dòng 7 trở xuống, mỗi dòng một bản ghi.</w:t>
@@ -327,7 +331,8 @@
         <w:pageBreakBefore/>
       </w:pPr>
       <w:r>
-        <w:t xml:space="preserve">2. Đọc bảng xem trước và xử lý dòng lỗi</w:t>
+        <w:lastRenderedPageBreak/>
+        <w:t>2. Đọc bảng xem trước và xử lý dòng lỗi</w:t>
       </w:r>
     </w:p>
     <w:p>
@@ -342,7 +347,7 @@
         <w:t xml:space="preserve">Vị trí: </w:t>
       </w:r>
       <w:r>
-        <w:t xml:space="preserve">Sau khi chọn file ở nút Nhập từ Excel</w:t>
+        <w:t>Sau khi chọn file ở nút Nhập từ Excel</w:t>
       </w:r>
     </w:p>
     <w:p>
@@ -350,20 +355,23 @@
         <w:spacing w:after="140"/>
       </w:pPr>
       <w:r>
-        <w:t xml:space="preserve">Bảng xem trước cho biết hệ thống đọc được gì TRƯỚC khi ghi. Đây là bước quan trọng nhất — soát ở đây rẻ hơn nhiều so với sửa số đã ghi.</w:t>
-      </w:r>
-    </w:p>
-    <w:p>
-      <w:pPr>
-        <w:spacing w:after="60" w:before="60"/>
+        <w:t>Bảng xem trước cho biết hệ thống đọc được gì TRƯỚC khi ghi. Đây là bước quan trọng nhất — soát ở đây rẻ hơn nhiều so với sửa số đã ghi.</w:t>
+      </w:r>
+    </w:p>
+    <w:p>
+      <w:pPr>
+        <w:spacing w:before="60" w:after="60"/>
         <w:jc w:val="center"/>
       </w:pPr>
       <w:r>
+        <w:rPr>
+          <w:noProof/>
+        </w:rPr>
         <w:drawing>
-          <wp:inline distT="0" distB="0" distL="0" distR="0">
+          <wp:inline distT="0" distB="0" distL="0" distR="0" wp14:anchorId="32ABDB4F" wp14:editId="06093641">
             <wp:extent cx="6191250" cy="3924300"/>
-            <wp:effectExtent t="0" r="0" b="0" l="0"/>
-            <wp:docPr id="1" name="img" descr="Ảnh hướng dẫn có đánh số bước" title="img/02-xem-truoc.png"/>
+            <wp:effectExtent l="0" t="0" r="0" b="0"/>
+            <wp:docPr id="1844791338" name="img" descr="Ảnh hướng dẫn có đánh số bước" title="img/02-xem-truoc.png"/>
             <wp:cNvGraphicFramePr>
               <a:graphicFrameLocks xmlns:a="http://schemas.openxmlformats.org/drawingml/2006/main" noChangeAspect="1"/>
             </wp:cNvGraphicFramePr>
@@ -371,13 +379,13 @@
               <a:graphicData uri="http://schemas.openxmlformats.org/drawingml/2006/picture">
                 <pic:pic xmlns:pic="http://schemas.openxmlformats.org/drawingml/2006/picture">
                   <pic:nvPicPr>
-                    <pic:cNvPr id="0" name="" descr=""/>
+                    <pic:cNvPr id="0" name=""/>
                     <pic:cNvPicPr>
                       <a:picLocks noChangeAspect="1" noChangeArrowheads="1"/>
                     </pic:cNvPicPr>
                   </pic:nvPicPr>
                   <pic:blipFill>
-                    <a:blip r:embed="rId9" cstate="none"/>
+                    <a:blip r:embed="rId8"/>
                     <a:srcRect/>
                     <a:stretch>
                       <a:fillRect/>
@@ -412,7 +420,7 @@
           <w:sz w:val="17"/>
           <w:szCs w:val="17"/>
         </w:rPr>
-        <w:t xml:space="preserve">Hình 2. Bảng xem trước — 2 dòng hợp lệ, 1 dòng lỗi</w:t>
+        <w:t>Hình 2. Bảng xem trước — 2 dòng hợp lệ, 1 dòng lỗi</w:t>
       </w:r>
     </w:p>
     <w:p>
@@ -424,7 +432,7 @@
           <w:b/>
           <w:bCs/>
         </w:rPr>
-        <w:t xml:space="preserve">Các bước:</w:t>
+        <w:t>Các bước:</w:t>
       </w:r>
     </w:p>
     <w:p>
@@ -441,7 +449,7 @@
           <w:b/>
           <w:bCs/>
         </w:rPr>
-        <w:t xml:space="preserve">Dòng tóm tắt</w:t>
+        <w:t>Dòng tóm tắt</w:t>
       </w:r>
       <w:r>
         <w:t xml:space="preserve"> — đọc được bao nhiêu dòng, bao nhiêu hợp lệ, bao nhiêu lỗi.</w:t>
@@ -461,7 +469,7 @@
           <w:b/>
           <w:bCs/>
         </w:rPr>
-        <w:t xml:space="preserve">Cột Trạng thái</w:t>
+        <w:t>Cột Trạng thái</w:t>
       </w:r>
       <w:r>
         <w:t xml:space="preserve"> — *Tạo mới* (ngày đó chưa có số) hoặc *Ghi đè* (đã có số, nhập lên sẽ thay).</w:t>
@@ -481,7 +489,7 @@
           <w:b/>
           <w:bCs/>
         </w:rPr>
-        <w:t xml:space="preserve">Dòng lỗi</w:t>
+        <w:t>Dòng lỗi</w:t>
       </w:r>
       <w:r>
         <w:t xml:space="preserve"> tô đỏ; cột </w:t>
@@ -491,7 +499,7 @@
           <w:b/>
           <w:bCs/>
         </w:rPr>
-        <w:t xml:space="preserve">Ghi chú</w:t>
+        <w:t>Ghi chú</w:t>
       </w:r>
       <w:r>
         <w:t xml:space="preserve"> ở cuối bảng (kéo ngang để xem) nói rõ sai ở đâu, vd *Loại mủ: 'SVR 99' không hợp lệ*.</w:t>
@@ -511,7 +519,7 @@
           <w:b/>
           <w:bCs/>
         </w:rPr>
-        <w:t xml:space="preserve">Xác nhận ghi N dòng</w:t>
+        <w:t>Xác nhận ghi N dòng</w:t>
       </w:r>
       <w:r>
         <w:t xml:space="preserve"> — số N chỉ đếm dòng HỢP LỆ. Dòng lỗi bị bỏ qua, không ghi gì.</w:t>
@@ -519,14 +527,14 @@
     </w:p>
     <w:p>
       <w:pPr>
-        <w:spacing w:after="80" w:before="140"/>
-      </w:pPr>
-      <w:r>
-        <w:rPr>
-          <w:b/>
-          <w:bCs/>
-        </w:rPr>
-        <w:t xml:space="preserve">Lưu ý:</w:t>
+        <w:spacing w:before="140" w:after="80"/>
+      </w:pPr>
+      <w:r>
+        <w:rPr>
+          <w:b/>
+          <w:bCs/>
+        </w:rPr>
+        <w:t>Lưu ý:</w:t>
       </w:r>
     </w:p>
     <w:p>
@@ -546,10 +554,10 @@
           <w:b/>
           <w:bCs/>
         </w:rPr>
-        <w:t xml:space="preserve">không bị nhân đôi</w:t>
-      </w:r>
-      <w:r>
-        <w:t xml:space="preserve">.</w:t>
+        <w:t>không bị nhân đôi</w:t>
+      </w:r>
+      <w:r>
+        <w:t>.</w:t>
       </w:r>
     </w:p>
     <w:p>
@@ -569,7 +577,7 @@
           <w:b/>
           <w:bCs/>
         </w:rPr>
-        <w:t xml:space="preserve">Dòng</w:t>
+        <w:t>Dòng</w:t>
       </w:r>
       <w:r>
         <w:t xml:space="preserve"> là số dòng trong file Excel, dùng để tìm nhanh chỗ cần sửa.</w:t>
@@ -592,7 +600,7 @@
           <w:b/>
           <w:bCs/>
         </w:rPr>
-        <w:t xml:space="preserve">giá trị hệ thống</w:t>
+        <w:t>giá trị hệ thống</w:t>
       </w:r>
       <w:r>
         <w:t xml:space="preserve"> của các cột chọn từ danh sách (vd *sales* / *sales_own*, *long_term*, *export*) chứ không phải nhãn tiếng Việt. Đây chỉ là cách hiển thị; số liệu ghi vào vẫn đúng.</w:t>
@@ -615,7 +623,7 @@
           <w:b/>
           <w:bCs/>
         </w:rPr>
-        <w:t xml:space="preserve">không</w:t>
+        <w:t>không</w:t>
       </w:r>
       <w:r>
         <w:t xml:space="preserve"> làm mất số Tồn kho của cùng ngày và ngược lại.</w:t>
@@ -627,7 +635,8 @@
         <w:pageBreakBefore/>
       </w:pPr>
       <w:r>
-        <w:t xml:space="preserve">3. Mẫu Thu mua</w:t>
+        <w:lastRenderedPageBreak/>
+        <w:t>3. Mẫu Thu mua</w:t>
       </w:r>
     </w:p>
     <w:p>
@@ -642,7 +651,7 @@
         <w:t xml:space="preserve">Vị trí: </w:t>
       </w:r>
       <w:r>
-        <w:t xml:space="preserve">Báo cáo thu mua → Tải mẫu Excel  ·  file đính kèm: mau/mau-thu-mua.xlsx</w:t>
+        <w:t>Báo cáo thu mua → Tải mẫu Excel  ·  file đính kèm: mau/mau-thu-mua.xlsx</w:t>
       </w:r>
     </w:p>
     <w:p>
@@ -650,15 +659,15 @@
         <w:spacing w:after="140"/>
       </w:pPr>
       <w:r>
-        <w:t xml:space="preserve">Mỗi dòng = một đơn vị trong một ngày. Đơn giá mủ nước và mủ chén nhập ở đây đồng thời ghi vào kho 'Giá mủ nguyên liệu'.</w:t>
-      </w:r>
-    </w:p>
-    <w:p>
-      <w:pPr>
-        <w:spacing w:after="100"/>
-      </w:pPr>
-      <w:r>
-        <w:t xml:space="preserve">Các cột (dấu * = bắt buộc):</w:t>
+        <w:t>Mỗi dòng = một đơn vị trong một ngày. Đơn giá mủ nước và mủ chén nhập ở đây đồng thời ghi vào kho 'Giá mủ nguyên liệu'.</w:t>
+      </w:r>
+    </w:p>
+    <w:p>
+      <w:pPr>
+        <w:spacing w:after="100"/>
+      </w:pPr>
+      <w:r>
+        <w:t>Các cột (dấu * = bắt buộc):</w:t>
       </w:r>
     </w:p>
     <w:p>
@@ -670,7 +679,7 @@
           <w:b/>
           <w:bCs/>
         </w:rPr>
-        <w:t xml:space="preserve">Các bước:</w:t>
+        <w:t>Các bước:</w:t>
       </w:r>
     </w:p>
     <w:p>
@@ -687,7 +696,7 @@
           <w:b/>
           <w:bCs/>
         </w:rPr>
-        <w:t xml:space="preserve">Đơn vị</w:t>
+        <w:t>Đơn vị</w:t>
       </w:r>
       <w:r>
         <w:t xml:space="preserve"> * — chỉ có ở mẫu của chuyên viên; mẫu của đơn vị thành viên không có cột này.</w:t>
@@ -707,7 +716,7 @@
           <w:b/>
           <w:bCs/>
         </w:rPr>
-        <w:t xml:space="preserve">Ngày</w:t>
+        <w:t>Ngày</w:t>
       </w:r>
       <w:r>
         <w:t xml:space="preserve"> * — dd/mm/yyyy.</w:t>
@@ -727,7 +736,7 @@
           <w:b/>
           <w:bCs/>
         </w:rPr>
-        <w:t xml:space="preserve">SL thu mua mủ nước</w:t>
+        <w:t>SL thu mua mủ nước</w:t>
       </w:r>
       <w:r>
         <w:t xml:space="preserve"> · </w:t>
@@ -737,7 +746,7 @@
           <w:b/>
           <w:bCs/>
         </w:rPr>
-        <w:t xml:space="preserve">SL thu mua mủ chén</w:t>
+        <w:t>SL thu mua mủ chén</w:t>
       </w:r>
       <w:r>
         <w:t xml:space="preserve"> — tấn (quy khô).</w:t>
@@ -757,7 +766,7 @@
           <w:b/>
           <w:bCs/>
         </w:rPr>
-        <w:t xml:space="preserve">Đơn giá mủ nước</w:t>
+        <w:t>Đơn giá mủ nước</w:t>
       </w:r>
       <w:r>
         <w:t xml:space="preserve"> — đồng/độ TSC.</w:t>
@@ -777,7 +786,7 @@
           <w:b/>
           <w:bCs/>
         </w:rPr>
-        <w:t xml:space="preserve">Đơn giá mủ chén</w:t>
+        <w:t>Đơn giá mủ chén</w:t>
       </w:r>
       <w:r>
         <w:t xml:space="preserve"> — đồng/độ; đơn vị tính phụ thuộc cột kế bên.</w:t>
@@ -797,7 +806,7 @@
           <w:b/>
           <w:bCs/>
         </w:rPr>
-        <w:t xml:space="preserve">Đơn giá mủ chén tính theo</w:t>
+        <w:t>Đơn giá mủ chén tính theo</w:t>
       </w:r>
       <w:r>
         <w:t xml:space="preserve"> — chọn *Độ TSC* hoặc *Độ DRC*; để trống hiểu là </w:t>
@@ -807,10 +816,10 @@
           <w:b/>
           <w:bCs/>
         </w:rPr>
-        <w:t xml:space="preserve">Độ TSC</w:t>
-      </w:r>
-      <w:r>
-        <w:t xml:space="preserve">.</w:t>
+        <w:t>Độ TSC</w:t>
+      </w:r>
+      <w:r>
+        <w:t>.</w:t>
       </w:r>
     </w:p>
     <w:p>
@@ -827,7 +836,7 @@
           <w:b/>
           <w:bCs/>
         </w:rPr>
-        <w:t xml:space="preserve">SL thu mua thành phẩm</w:t>
+        <w:t>SL thu mua thành phẩm</w:t>
       </w:r>
       <w:r>
         <w:t xml:space="preserve"> — tấn (mua lại mủ đã chế biến).</w:t>
@@ -847,7 +856,7 @@
           <w:b/>
           <w:bCs/>
         </w:rPr>
-        <w:t xml:space="preserve">Đơn giá thành phẩm (VNĐ)</w:t>
+        <w:t>Đơn giá thành phẩm (VNĐ)</w:t>
       </w:r>
       <w:r>
         <w:t xml:space="preserve"> — triệu đ/tấn.  </w:t>
@@ -857,7 +866,7 @@
           <w:b/>
           <w:bCs/>
         </w:rPr>
-        <w:t xml:space="preserve">Đơn giá thành phẩm (ngoại tệ)</w:t>
+        <w:t>Đơn giá thành phẩm (ngoại tệ)</w:t>
       </w:r>
       <w:r>
         <w:t xml:space="preserve"> — USD/tấn.</w:t>
@@ -865,14 +874,14 @@
     </w:p>
     <w:p>
       <w:pPr>
-        <w:spacing w:after="80" w:before="140"/>
-      </w:pPr>
-      <w:r>
-        <w:rPr>
-          <w:b/>
-          <w:bCs/>
-        </w:rPr>
-        <w:t xml:space="preserve">Lưu ý:</w:t>
+        <w:spacing w:before="140" w:after="80"/>
+      </w:pPr>
+      <w:r>
+        <w:rPr>
+          <w:b/>
+          <w:bCs/>
+        </w:rPr>
+        <w:t>Lưu ý:</w:t>
       </w:r>
     </w:p>
     <w:p>
@@ -892,7 +901,7 @@
           <w:b/>
           <w:bCs/>
         </w:rPr>
-        <w:t xml:space="preserve">không tổ chức thu mua</w:t>
+        <w:t>không tổ chức thu mua</w:t>
       </w:r>
       <w:r>
         <w:t xml:space="preserve"> thì không nhập bằng Excel — vào form trên web tích ô 'Hôm nay đơn vị KHÔNG tổ chức thu mua', vì đó là tình huống khác với 'có mua nhưng mua được 0 tấn'.</w:t>
@@ -915,7 +924,7 @@
           <w:b/>
           <w:bCs/>
         </w:rPr>
-        <w:t xml:space="preserve">không còn ở biểu Thu mua</w:t>
+        <w:t>không còn ở biểu Thu mua</w:t>
       </w:r>
       <w:r>
         <w:t xml:space="preserve"> — đã chuyển sang biểu Tiêu thụ.</w:t>
@@ -927,7 +936,8 @@
         <w:pageBreakBefore/>
       </w:pPr>
       <w:r>
-        <w:t xml:space="preserve">4. Mẫu Tiêu thụ</w:t>
+        <w:lastRenderedPageBreak/>
+        <w:t>4. Mẫu Tiêu thụ</w:t>
       </w:r>
     </w:p>
     <w:p>
@@ -942,7 +952,7 @@
         <w:t xml:space="preserve">Vị trí: </w:t>
       </w:r>
       <w:r>
-        <w:t xml:space="preserve">Báo cáo tiêu thụ → Tải mẫu Excel  ·  file đính kèm: mau/mau-tieu-thu.xlsx</w:t>
+        <w:t>Báo cáo tiêu thụ → Tải mẫu Excel  ·  file đính kèm: mau/mau-tieu-thu.xlsx</w:t>
       </w:r>
     </w:p>
     <w:p>
@@ -950,15 +960,15 @@
         <w:spacing w:after="140"/>
       </w:pPr>
       <w:r>
-        <w:t xml:space="preserve">Mỗi dòng = một hợp đồng bán. Cùng một đơn vị và một ngày có thể có nhiều dòng, hệ thống tự cộng lại.</w:t>
-      </w:r>
-    </w:p>
-    <w:p>
-      <w:pPr>
-        <w:spacing w:after="100"/>
-      </w:pPr>
-      <w:r>
-        <w:t xml:space="preserve">Các cột (dấu * = bắt buộc):</w:t>
+        <w:t>Mỗi dòng = một hợp đồng bán. Cùng một đơn vị và một ngày có thể có nhiều dòng, hệ thống tự cộng lại.</w:t>
+      </w:r>
+    </w:p>
+    <w:p>
+      <w:pPr>
+        <w:spacing w:after="100"/>
+      </w:pPr>
+      <w:r>
+        <w:t>Các cột (dấu * = bắt buộc):</w:t>
       </w:r>
     </w:p>
     <w:p>
@@ -970,7 +980,7 @@
           <w:b/>
           <w:bCs/>
         </w:rPr>
-        <w:t xml:space="preserve">Các bước:</w:t>
+        <w:t>Các bước:</w:t>
       </w:r>
     </w:p>
     <w:p>
@@ -987,7 +997,7 @@
           <w:b/>
           <w:bCs/>
         </w:rPr>
-        <w:t xml:space="preserve">Đơn vị</w:t>
+        <w:t>Đơn vị</w:t>
       </w:r>
       <w:r>
         <w:t xml:space="preserve"> * · </w:t>
@@ -997,7 +1007,7 @@
           <w:b/>
           <w:bCs/>
         </w:rPr>
-        <w:t xml:space="preserve">Ngày</w:t>
+        <w:t>Ngày</w:t>
       </w:r>
       <w:r>
         <w:t xml:space="preserve"> * — như mẫu Thu mua.</w:t>
@@ -1017,7 +1027,7 @@
           <w:b/>
           <w:bCs/>
         </w:rPr>
-        <w:t xml:space="preserve">Nguồn mủ</w:t>
+        <w:t>Nguồn mủ</w:t>
       </w:r>
       <w:r>
         <w:t xml:space="preserve"> — chọn *Mủ thu mua* hoặc *Mủ khai thác*; để trống hiểu là </w:t>
@@ -1027,10 +1037,10 @@
           <w:b/>
           <w:bCs/>
         </w:rPr>
-        <w:t xml:space="preserve">Mủ thu mua</w:t>
-      </w:r>
-      <w:r>
-        <w:t xml:space="preserve">. Hai nguồn lưu riêng nhưng mọi số tổng cộng chung.</w:t>
+        <w:t>Mủ thu mua</w:t>
+      </w:r>
+      <w:r>
+        <w:t>. Hai nguồn lưu riêng nhưng mọi số tổng cộng chung.</w:t>
       </w:r>
     </w:p>
     <w:p>
@@ -1047,7 +1057,7 @@
           <w:b/>
           <w:bCs/>
         </w:rPr>
-        <w:t xml:space="preserve">Loại HĐ</w:t>
+        <w:t>Loại HĐ</w:t>
       </w:r>
       <w:r>
         <w:t xml:space="preserve"> * (*Dài hạn* / *Chuyến*) · </w:t>
@@ -1057,7 +1067,7 @@
           <w:b/>
           <w:bCs/>
         </w:rPr>
-        <w:t xml:space="preserve">Hình thức</w:t>
+        <w:t>Hình thức</w:t>
       </w:r>
       <w:r>
         <w:t xml:space="preserve"> * (*XK / UTXK* / *Nội tiêu*) · </w:t>
@@ -1067,7 +1077,7 @@
           <w:b/>
           <w:bCs/>
         </w:rPr>
-        <w:t xml:space="preserve">Loại mủ</w:t>
+        <w:t>Loại mủ</w:t>
       </w:r>
       <w:r>
         <w:t xml:space="preserve"> * — phải chọn đúng giá trị trong danh sách.</w:t>
@@ -1087,7 +1097,7 @@
           <w:b/>
           <w:bCs/>
         </w:rPr>
-        <w:t xml:space="preserve">Số lượng</w:t>
+        <w:t>Số lượng</w:t>
       </w:r>
       <w:r>
         <w:t xml:space="preserve"> — tấn.</w:t>
@@ -1107,7 +1117,7 @@
           <w:b/>
           <w:bCs/>
         </w:rPr>
-        <w:t xml:space="preserve">Giá bán</w:t>
+        <w:t>Giá bán</w:t>
       </w:r>
       <w:r>
         <w:t xml:space="preserve"> — đơn vị tuỳ cột kế bên: </w:t>
@@ -1117,7 +1127,7 @@
           <w:b/>
           <w:bCs/>
         </w:rPr>
-        <w:t xml:space="preserve">triệu đ/tấn</w:t>
+        <w:t>triệu đ/tấn</w:t>
       </w:r>
       <w:r>
         <w:t xml:space="preserve"> khi VND, </w:t>
@@ -1127,7 +1137,7 @@
           <w:b/>
           <w:bCs/>
         </w:rPr>
-        <w:t xml:space="preserve">USD/tấn</w:t>
+        <w:t>USD/tấn</w:t>
       </w:r>
       <w:r>
         <w:t xml:space="preserve"> khi USD.</w:t>
@@ -1147,7 +1157,7 @@
           <w:b/>
           <w:bCs/>
         </w:rPr>
-        <w:t xml:space="preserve">Giá bán bằng</w:t>
+        <w:t>Giá bán bằng</w:t>
       </w:r>
       <w:r>
         <w:t xml:space="preserve"> — *VND* hoặc *USD*, chọn cho </w:t>
@@ -1157,10 +1167,10 @@
           <w:b/>
           <w:bCs/>
         </w:rPr>
-        <w:t xml:space="preserve">TỪNG DÒNG</w:t>
-      </w:r>
-      <w:r>
-        <w:t xml:space="preserve">. Trong một ngày vừa bán USD vừa bán VNĐ vẫn nhập chung một file.</w:t>
+        <w:t>TỪNG DÒNG</w:t>
+      </w:r>
+      <w:r>
+        <w:t>. Trong một ngày vừa bán USD vừa bán VNĐ vẫn nhập chung một file.</w:t>
       </w:r>
     </w:p>
     <w:p>
@@ -1177,7 +1187,7 @@
           <w:b/>
           <w:bCs/>
         </w:rPr>
-        <w:t xml:space="preserve">Ngày xuất kho</w:t>
+        <w:t>Ngày xuất kho</w:t>
       </w:r>
       <w:r>
         <w:t xml:space="preserve"> · </w:t>
@@ -1187,7 +1197,7 @@
           <w:b/>
           <w:bCs/>
         </w:rPr>
-        <w:t xml:space="preserve">Ngày xuất hoá đơn</w:t>
+        <w:t>Ngày xuất hoá đơn</w:t>
       </w:r>
       <w:r>
         <w:t xml:space="preserve"> — dd/mm/yyyy, chưa có thì để trống.</w:t>
@@ -1195,14 +1205,14 @@
     </w:p>
     <w:p>
       <w:pPr>
-        <w:spacing w:after="80" w:before="140"/>
-      </w:pPr>
-      <w:r>
-        <w:rPr>
-          <w:b/>
-          <w:bCs/>
-        </w:rPr>
-        <w:t xml:space="preserve">Lưu ý:</w:t>
+        <w:spacing w:before="140" w:after="80"/>
+      </w:pPr>
+      <w:r>
+        <w:rPr>
+          <w:b/>
+          <w:bCs/>
+        </w:rPr>
+        <w:t>Lưu ý:</w:t>
       </w:r>
     </w:p>
     <w:p>
@@ -1215,14 +1225,14 @@
         <w:spacing w:after="80"/>
       </w:pPr>
       <w:r>
-        <w:t xml:space="preserve">⚠️ File Tiêu thụ </w:t>
-      </w:r>
-      <w:r>
-        <w:rPr>
-          <w:b/>
-          <w:bCs/>
-        </w:rPr>
-        <w:t xml:space="preserve">ghi đè toàn bộ</w:t>
+        <w:t xml:space="preserve">File Tiêu thụ </w:t>
+      </w:r>
+      <w:r>
+        <w:rPr>
+          <w:b/>
+          <w:bCs/>
+        </w:rPr>
+        <w:t>ghi đè toàn bộ</w:t>
       </w:r>
       <w:r>
         <w:t xml:space="preserve"> phần tiêu thụ của ngày đó, </w:t>
@@ -1232,10 +1242,10 @@
           <w:b/>
           <w:bCs/>
         </w:rPr>
-        <w:t xml:space="preserve">cả mủ thu mua lẫn mủ khai thác</w:t>
-      </w:r>
-      <w:r>
-        <w:t xml:space="preserve">. Dòng nào đã nhập trên web mà không có trong file sẽ bị xoá — hãy chép đủ cả hai nguồn vào file trước khi nhập.</w:t>
+        <w:t>cả mủ thu mua lẫn mủ khai thác</w:t>
+      </w:r>
+      <w:r>
+        <w:t>. Dòng nào đã nhập trên web mà không có trong file sẽ bị xoá — hãy chép đủ cả hai nguồn vào file trước khi nhập.</w:t>
       </w:r>
     </w:p>
     <w:p>
@@ -1255,7 +1265,7 @@
           <w:b/>
           <w:bCs/>
         </w:rPr>
-        <w:t xml:space="preserve">USD</w:t>
+        <w:t>USD</w:t>
       </w:r>
       <w:r>
         <w:t xml:space="preserve"> cần tỷ giá USD/VNĐ mới tính được doanh thu. Tỷ giá nhập trên web (màn Báo cáo tiêu thụ, nút *Lấy tỷ giá VCB*), Excel không mang theo. Thiếu tỷ giá thì dòng đó chưa được cộng vào doanh thu và hệ thống sẽ báo lại.</w:t>
@@ -1275,10 +1285,10 @@
           <w:b/>
           <w:bCs/>
         </w:rPr>
-        <w:t xml:space="preserve">Ba file đính kèm — bộ Hợp đồng · phiếu xuất kho · hoá đơn — phải tải lên trên web</w:t>
-      </w:r>
-      <w:r>
-        <w:t xml:space="preserve">, file Excel không mang theo file đính kèm được.</w:t>
+        <w:t>Ba file đính kèm — bộ Hợp đồng · phiếu xuất kho · hoá đơn — phải tải lên trên web</w:t>
+      </w:r>
+      <w:r>
+        <w:t>, file Excel không mang theo file đính kèm được.</w:t>
       </w:r>
     </w:p>
     <w:p>
@@ -1287,7 +1297,8 @@
         <w:pageBreakBefore/>
       </w:pPr>
       <w:r>
-        <w:t xml:space="preserve">5. Mẫu Tồn kho</w:t>
+        <w:lastRenderedPageBreak/>
+        <w:t>5. Mẫu Tồn kho</w:t>
       </w:r>
     </w:p>
     <w:p>
@@ -1302,7 +1313,7 @@
         <w:t xml:space="preserve">Vị trí: </w:t>
       </w:r>
       <w:r>
-        <w:t xml:space="preserve">Báo cáo tồn kho → Tải mẫu Excel  ·  file đính kèm: mau/mau-ton-kho.xlsx</w:t>
+        <w:t>Báo cáo tồn kho → Tải mẫu Excel  ·  file đính kèm: mau/mau-ton-kho.xlsx</w:t>
       </w:r>
     </w:p>
     <w:p>
@@ -1310,15 +1321,15 @@
         <w:spacing w:after="140"/>
       </w:pPr>
       <w:r>
-        <w:t xml:space="preserve">Mỗi dòng = một dòng tồn kho. Tồn kho là số tại thời điểm cuối ngày, KHÔNG cộng dồn giữa các ngày, đơn vị tính là tấn.</w:t>
-      </w:r>
-    </w:p>
-    <w:p>
-      <w:pPr>
-        <w:spacing w:after="100"/>
-      </w:pPr>
-      <w:r>
-        <w:t xml:space="preserve">Các cột (dấu * = bắt buộc):</w:t>
+        <w:t>Mỗi dòng = một dòng tồn kho. Tồn kho là số tại thời điểm cuối ngày, KHÔNG cộng dồn giữa các ngày, đơn vị tính là tấn.</w:t>
+      </w:r>
+    </w:p>
+    <w:p>
+      <w:pPr>
+        <w:spacing w:after="100"/>
+      </w:pPr>
+      <w:r>
+        <w:t>Các cột (dấu * = bắt buộc):</w:t>
       </w:r>
     </w:p>
     <w:p>
@@ -1330,7 +1341,7 @@
           <w:b/>
           <w:bCs/>
         </w:rPr>
-        <w:t xml:space="preserve">Các bước:</w:t>
+        <w:t>Các bước:</w:t>
       </w:r>
     </w:p>
     <w:p>
@@ -1347,7 +1358,7 @@
           <w:b/>
           <w:bCs/>
         </w:rPr>
-        <w:t xml:space="preserve">Đơn vị</w:t>
+        <w:t>Đơn vị</w:t>
       </w:r>
       <w:r>
         <w:t xml:space="preserve"> * · </w:t>
@@ -1357,7 +1368,7 @@
           <w:b/>
           <w:bCs/>
         </w:rPr>
-        <w:t xml:space="preserve">Ngày</w:t>
+        <w:t>Ngày</w:t>
       </w:r>
       <w:r>
         <w:t xml:space="preserve"> * — như trên.</w:t>
@@ -1377,7 +1388,7 @@
           <w:b/>
           <w:bCs/>
         </w:rPr>
-        <w:t xml:space="preserve">Nhóm</w:t>
+        <w:t>Nhóm</w:t>
       </w:r>
       <w:r>
         <w:t xml:space="preserve"> * — chọn một trong ba: *Chế biến chưa nhập kho* · *Đã nhập kho* · *Đã ký HĐ*.</w:t>
@@ -1397,7 +1408,7 @@
           <w:b/>
           <w:bCs/>
         </w:rPr>
-        <w:t xml:space="preserve">Chủng loại</w:t>
+        <w:t>Chủng loại</w:t>
       </w:r>
       <w:r>
         <w:t xml:space="preserve"> * — chọn đúng giá trị trong danh sách.</w:t>
@@ -1417,7 +1428,7 @@
           <w:b/>
           <w:bCs/>
         </w:rPr>
-        <w:t xml:space="preserve">Số lượng</w:t>
+        <w:t>Số lượng</w:t>
       </w:r>
       <w:r>
         <w:t xml:space="preserve"> — tấn.</w:t>
@@ -1437,7 +1448,7 @@
           <w:b/>
           <w:bCs/>
         </w:rPr>
-        <w:t xml:space="preserve">Đơn giá</w:t>
+        <w:t>Đơn giá</w:t>
       </w:r>
       <w:r>
         <w:t xml:space="preserve"> và </w:t>
@@ -1447,7 +1458,7 @@
           <w:b/>
           <w:bCs/>
         </w:rPr>
-        <w:t xml:space="preserve">Đơn giá bằng</w:t>
+        <w:t>Đơn giá bằng</w:t>
       </w:r>
       <w:r>
         <w:t xml:space="preserve"> (*VND* / *USD*) — chỉ dùng cho nhóm *Đã ký HĐ*.</w:t>
@@ -1467,7 +1478,7 @@
           <w:b/>
           <w:bCs/>
         </w:rPr>
-        <w:t xml:space="preserve">Lịch giao</w:t>
+        <w:t>Lịch giao</w:t>
       </w:r>
       <w:r>
         <w:t xml:space="preserve"> — dd/mm/yyyy, chỉ dùng cho nhóm *Đã ký HĐ*.</w:t>
@@ -1487,7 +1498,7 @@
           <w:b/>
           <w:bCs/>
         </w:rPr>
-        <w:t xml:space="preserve">Tồn kho nguyên liệu chưa sản xuất (quy khô)</w:t>
+        <w:t>Tồn kho nguyên liệu chưa sản xuất (quy khô)</w:t>
       </w:r>
       <w:r>
         <w:t xml:space="preserve"> — tấn; điền ở MỘT dòng bất kỳ của ngày đó là đủ.</w:t>
@@ -1495,14 +1506,14 @@
     </w:p>
     <w:p>
       <w:pPr>
-        <w:spacing w:after="80" w:before="140"/>
-      </w:pPr>
-      <w:r>
-        <w:rPr>
-          <w:b/>
-          <w:bCs/>
-        </w:rPr>
-        <w:t xml:space="preserve">Lưu ý:</w:t>
+        <w:spacing w:before="140" w:after="80"/>
+      </w:pPr>
+      <w:r>
+        <w:rPr>
+          <w:b/>
+          <w:bCs/>
+        </w:rPr>
+        <w:t>Lưu ý:</w:t>
       </w:r>
     </w:p>
     <w:p>
@@ -1522,10 +1533,10 @@
           <w:b/>
           <w:bCs/>
         </w:rPr>
-        <w:t xml:space="preserve">cam kết giao hàng</w:t>
-      </w:r>
-      <w:r>
-        <w:t xml:space="preserve">, đứng riêng — không cộng vào và không trừ khỏi tồn kho thành phẩm, nên ký nhiều hơn lượng đang có cũng không sao.</w:t>
+        <w:t>cam kết giao hàng</w:t>
+      </w:r>
+      <w:r>
+        <w:t>, đứng riêng — không cộng vào và không trừ khỏi tồn kho thành phẩm, nên ký nhiều hơn lượng đang có cũng không sao.</w:t>
       </w:r>
     </w:p>
     <w:p>
@@ -1542,7 +1553,7 @@
           <w:b/>
           <w:bCs/>
         </w:rPr>
-        <w:t xml:space="preserve">File Hợp đồng đã ký scan</w:t>
+        <w:t>File Hợp đồng đã ký scan</w:t>
       </w:r>
       <w:r>
         <w:t xml:space="preserve"> phải đính kèm trên web, Excel không mang theo được.</w:t>
@@ -1565,7 +1576,7 @@
           <w:b/>
           <w:bCs/>
         </w:rPr>
-        <w:t xml:space="preserve">SVR CV 50</w:t>
+        <w:t>SVR CV 50</w:t>
       </w:r>
       <w:r>
         <w:t xml:space="preserve"> và </w:t>
@@ -1575,7 +1586,7 @@
           <w:b/>
           <w:bCs/>
         </w:rPr>
-        <w:t xml:space="preserve">SVR CV60</w:t>
+        <w:t>SVR CV60</w:t>
       </w:r>
       <w:r>
         <w:t xml:space="preserve"> là hai loại riêng.</w:t>
@@ -1587,7 +1598,8 @@
         <w:pageBreakBefore/>
       </w:pPr>
       <w:r>
-        <w:t xml:space="preserve">6. Lỗi thường gặp</w:t>
+        <w:lastRenderedPageBreak/>
+        <w:t>6. Lỗi thường gặp</w:t>
       </w:r>
     </w:p>
     <w:p>
@@ -1595,15 +1607,15 @@
         <w:spacing w:after="140"/>
       </w:pPr>
       <w:r>
-        <w:t xml:space="preserve">Các lỗi hay gặp nhất khi nhập file, và cách xử lý.</w:t>
-      </w:r>
-    </w:p>
-    <w:p>
-      <w:pPr>
-        <w:spacing w:after="100"/>
-      </w:pPr>
-      <w:r>
-        <w:t xml:space="preserve">Đối chiếu thông báo ở cột Ghi chú:</w:t>
+        <w:t>Các lỗi hay gặp nhất khi nhập file, và cách xử lý.</w:t>
+      </w:r>
+    </w:p>
+    <w:p>
+      <w:pPr>
+        <w:spacing w:after="100"/>
+      </w:pPr>
+      <w:r>
+        <w:t>Đối chiếu thông báo ở cột Ghi chú:</w:t>
       </w:r>
     </w:p>
     <w:p>
@@ -1615,7 +1627,7 @@
           <w:b/>
           <w:bCs/>
         </w:rPr>
-        <w:t xml:space="preserve">Các bước:</w:t>
+        <w:t>Các bước:</w:t>
       </w:r>
     </w:p>
     <w:p>
@@ -1635,7 +1647,7 @@
           <w:b/>
           <w:bCs/>
         </w:rPr>
-        <w:t xml:space="preserve">Date</w:t>
+        <w:t>Date</w:t>
       </w:r>
       <w:r>
         <w:t xml:space="preserve"> hoặc gõ đúng dd/mm/yyyy.</w:t>
@@ -1651,7 +1663,7 @@
         <w:spacing w:after="100"/>
       </w:pPr>
       <w:r>
-        <w:t xml:space="preserve">*Loại mủ: '…' không hợp lệ* — gõ sai tên chủng loại. Dùng ô chọn sẵn (dropdown) trong file mẫu, đừng gõ tay.</w:t>
+        <w:t>*Loại mủ: '…' không hợp lệ* — gõ sai tên chủng loại. Dùng ô chọn sẵn (dropdown) trong file mẫu, đừng gõ tay.</w:t>
       </w:r>
     </w:p>
     <w:p>
@@ -1664,7 +1676,7 @@
         <w:spacing w:after="100"/>
       </w:pPr>
       <w:r>
-        <w:t xml:space="preserve">*Đơn vị '…' không có trong danh mục* — sai tên đơn vị; lấy đúng tên trong ô chọn của file mẫu.</w:t>
+        <w:t>*Đơn vị '…' không có trong danh mục* — sai tên đơn vị; lấy đúng tên trong ô chọn của file mẫu.</w:t>
       </w:r>
     </w:p>
     <w:p>
@@ -1677,7 +1689,7 @@
         <w:spacing w:after="100"/>
       </w:pPr>
       <w:r>
-        <w:t xml:space="preserve">*Đơn vị '…' không thuộc quyền của tài khoản* — đang nhập cho đơn vị khác. Tài khoản đơn vị chỉ nhập được cho chính mình.</w:t>
+        <w:t>*Đơn vị '…' không thuộc quyền của tài khoản* — đang nhập cho đơn vị khác. Tài khoản đơn vị chỉ nhập được cho chính mình.</w:t>
       </w:r>
     </w:p>
     <w:p>
@@ -1690,7 +1702,7 @@
         <w:spacing w:after="100"/>
       </w:pPr>
       <w:r>
-        <w:t xml:space="preserve">*File thiếu cột bắt buộc* — đang dùng file cũ hoặc đã sửa tên cột. Tải lại mẫu mới và chép số sang.</w:t>
+        <w:t>*File thiếu cột bắt buộc* — đang dùng file cũ hoặc đã sửa tên cột. Tải lại mẫu mới và chép số sang.</w:t>
       </w:r>
     </w:p>
     <w:p>
@@ -1703,19 +1715,19 @@
         <w:spacing w:after="100"/>
       </w:pPr>
       <w:r>
-        <w:t xml:space="preserve">*… không phải số* — ô có chữ hoặc ký tự lạ (dấu cách, đơn vị tính). Chỉ để lại con số.</w:t>
-      </w:r>
-    </w:p>
-    <w:p>
-      <w:pPr>
-        <w:spacing w:after="80" w:before="140"/>
-      </w:pPr>
-      <w:r>
-        <w:rPr>
-          <w:b/>
-          <w:bCs/>
-        </w:rPr>
-        <w:t xml:space="preserve">Lưu ý:</w:t>
+        <w:t>*… không phải số* — ô có chữ hoặc ký tự lạ (dấu cách, đơn vị tính). Chỉ để lại con số.</w:t>
+      </w:r>
+    </w:p>
+    <w:p>
+      <w:pPr>
+        <w:spacing w:before="140" w:after="80"/>
+      </w:pPr>
+      <w:r>
+        <w:rPr>
+          <w:b/>
+          <w:bCs/>
+        </w:rPr>
+        <w:t>Lưu ý:</w:t>
       </w:r>
     </w:p>
     <w:p>
@@ -1728,7 +1740,7 @@
         <w:spacing w:after="80"/>
       </w:pPr>
       <w:r>
-        <w:t xml:space="preserve">Chỉ nhập được ngày hôm nay và một số ngày gần nhất theo quy định; ngày cũ hơn hệ thống sẽ từ chối ghi.</w:t>
+        <w:t>Chỉ nhập được ngày hôm nay và một số ngày gần nhất theo quy định; ngày cũ hơn hệ thống sẽ từ chối ghi.</w:t>
       </w:r>
     </w:p>
     <w:p>
@@ -1748,40 +1760,27 @@
           <w:b/>
           <w:bCs/>
         </w:rPr>
-        <w:t xml:space="preserve">ghi đè</w:t>
-      </w:r>
-      <w:r>
-        <w:t xml:space="preserve">, không nhân đôi — cứ sửa file rồi nhập lại cho tới khi đúng.</w:t>
+        <w:t>ghi đè</w:t>
+      </w:r>
+      <w:r>
+        <w:t>, không nhân đôi — cứ sửa file rồi nhập lại cho tới khi đúng.</w:t>
       </w:r>
     </w:p>
     <w:sectPr>
-      <w:headerReference w:type="default" r:id="rId7"/>
-      <w:pgSz w:w="11906" w:h="16838" w:orient="portrait"/>
+      <w:headerReference w:type="default" r:id="rId9"/>
+      <w:pgSz w:w="11906" w:h="16838"/>
       <w:pgMar w:top="1440" w:right="1080" w:bottom="1080" w:left="1080" w:header="708" w:footer="708" w:gutter="0"/>
-      <w:pgNumType/>
+      <w:cols w:space="720"/>
       <w:docGrid w:linePitch="360"/>
     </w:sectPr>
   </w:body>
 </w:document>
 </file>
 
-<file path=word/comments.xml><?xml version="1.0" encoding="utf-8"?>
-<w:comments xmlns:cx="http://schemas.microsoft.com/office/drawing/2014/chartex" xmlns:cx1="http://schemas.microsoft.com/office/drawing/2015/9/8/chartex" xmlns:cx2="http://schemas.microsoft.com/office/drawing/2015/10/21/chartex" xmlns:cx3="http://schemas.microsoft.com/office/drawing/2016/5/9/chartex" xmlns:cx4="http://schemas.microsoft.com/office/drawing/2016/5/10/chartex" xmlns:cx5="http://schemas.microsoft.com/office/drawing/2016/5/11/chartex" xmlns:cx6="http://schemas.microsoft.com/office/drawing/2016/5/12/chartex" xmlns:cx7="http://schemas.microsoft.com/office/drawing/2016/5/13/chartex" xmlns:cx8="http://schemas.microsoft.com/office/drawing/2016/5/14/chartex" xmlns:mc="http://schemas.openxmlformats.org/markup-compatibility/2006" xmlns:aink="http://schemas.microsoft.com/office/drawing/2016/ink" xmlns:am3d="http://schemas.microsoft.com/office/drawing/2017/model3d" xmlns:o="urn:schemas-microsoft-com:office:office" xmlns:r="http://schemas.openxmlformats.org/officeDocument/2006/relationships" xmlns:m="http://schemas.openxmlformats.org/officeDocument/2006/math" xmlns:v="urn:schemas-microsoft-com:vml" xmlns:wp14="http://schemas.microsoft.com/office/word/2010/wordprocessingDrawing" xmlns:wp="http://schemas.openxmlformats.org/drawingml/2006/wordprocessingDrawing" xmlns:w10="urn:schemas-microsoft-com:office:word" xmlns:w="http://schemas.openxmlformats.org/wordprocessingml/2006/main" xmlns:w14="http://schemas.microsoft.com/office/word/2010/wordml" xmlns:w15="http://schemas.microsoft.com/office/word/2012/wordml" xmlns:w16cex="http://schemas.microsoft.com/office/word/2018/wordml/cex" xmlns:w16cid="http://schemas.microsoft.com/office/word/2016/wordml/cid" xmlns:w16="http://schemas.microsoft.com/office/word/2018/wordml" xmlns:w16sdtdh="http://schemas.microsoft.com/office/word/2020/wordml/sdtdatahash" xmlns:w16se="http://schemas.microsoft.com/office/word/2015/wordml/symex" xmlns:wpg="http://schemas.microsoft.com/office/word/2010/wordprocessingGroup" xmlns:wpi="http://schemas.microsoft.com/office/word/2010/wordprocessingInk" xmlns:wne="http://schemas.microsoft.com/office/word/2006/wordml" xmlns:wps="http://schemas.microsoft.com/office/word/2010/wordprocessingShape"/>
-</file>
-
 <file path=word/endnotes.xml><?xml version="1.0" encoding="utf-8"?>
-<w:endnotes xmlns:wpc="http://schemas.microsoft.com/office/word/2010/wordprocessingCanvas" xmlns:mc="http://schemas.openxmlformats.org/markup-compatibility/2006" xmlns:o="urn:schemas-microsoft-com:office:office" xmlns:r="http://schemas.openxmlformats.org/officeDocument/2006/relationships" xmlns:m="http://schemas.openxmlformats.org/officeDocument/2006/math" xmlns:v="urn:schemas-microsoft-com:vml" xmlns:wp14="http://schemas.microsoft.com/office/word/2010/wordprocessingDrawing" xmlns:wp="http://schemas.openxmlformats.org/drawingml/2006/wordprocessingDrawing" xmlns:w10="urn:schemas-microsoft-com:office:word" xmlns:w="http://schemas.openxmlformats.org/wordprocessingml/2006/main" xmlns:w14="http://schemas.microsoft.com/office/word/2010/wordml" xmlns:w15="http://schemas.microsoft.com/office/word/2012/wordml" xmlns:wpg="http://schemas.microsoft.com/office/word/2010/wordprocessingGroup" xmlns:wpi="http://schemas.microsoft.com/office/word/2010/wordprocessingInk" xmlns:wne="http://schemas.microsoft.com/office/word/2006/wordml" xmlns:wps="http://schemas.microsoft.com/office/word/2010/wordprocessingShape" mc:Ignorable="w14 w15 wp14">
+<w:endnotes xmlns:wpc="http://schemas.microsoft.com/office/word/2010/wordprocessingCanvas" xmlns:cx="http://schemas.microsoft.com/office/drawing/2014/chartex" xmlns:cx1="http://schemas.microsoft.com/office/drawing/2015/9/8/chartex" xmlns:cx2="http://schemas.microsoft.com/office/drawing/2015/10/21/chartex" xmlns:cx3="http://schemas.microsoft.com/office/drawing/2016/5/9/chartex" xmlns:cx4="http://schemas.microsoft.com/office/drawing/2016/5/10/chartex" xmlns:cx5="http://schemas.microsoft.com/office/drawing/2016/5/11/chartex" xmlns:cx6="http://schemas.microsoft.com/office/drawing/2016/5/12/chartex" xmlns:cx7="http://schemas.microsoft.com/office/drawing/2016/5/13/chartex" xmlns:cx8="http://schemas.microsoft.com/office/drawing/2016/5/14/chartex" xmlns:mc="http://schemas.openxmlformats.org/markup-compatibility/2006" xmlns:aink="http://schemas.microsoft.com/office/drawing/2016/ink" xmlns:am3d="http://schemas.microsoft.com/office/drawing/2017/model3d" xmlns:o="urn:schemas-microsoft-com:office:office" xmlns:oel="http://schemas.microsoft.com/office/2019/extlst" xmlns:r="http://schemas.openxmlformats.org/officeDocument/2006/relationships" xmlns:m="http://schemas.openxmlformats.org/officeDocument/2006/math" xmlns:v="urn:schemas-microsoft-com:vml" xmlns:wp14="http://schemas.microsoft.com/office/word/2010/wordprocessingDrawing" xmlns:wp="http://schemas.openxmlformats.org/drawingml/2006/wordprocessingDrawing" xmlns:w10="urn:schemas-microsoft-com:office:word" xmlns:w="http://schemas.openxmlformats.org/wordprocessingml/2006/main" xmlns:w14="http://schemas.microsoft.com/office/word/2010/wordml" xmlns:w15="http://schemas.microsoft.com/office/word/2012/wordml" xmlns:w16cex="http://schemas.microsoft.com/office/word/2018/wordml/cex" xmlns:w16cid="http://schemas.microsoft.com/office/word/2016/wordml/cid" xmlns:w16="http://schemas.microsoft.com/office/word/2018/wordml" xmlns:w16du="http://schemas.microsoft.com/office/word/2023/wordml/word16du" xmlns:w16sdtdh="http://schemas.microsoft.com/office/word/2020/wordml/sdtdatahash" xmlns:w16sdtfl="http://schemas.microsoft.com/office/word/2024/wordml/sdtformatlock" xmlns:w16se="http://schemas.microsoft.com/office/word/2015/wordml/symex" xmlns:wpg="http://schemas.microsoft.com/office/word/2010/wordprocessingGroup" xmlns:wpi="http://schemas.microsoft.com/office/word/2010/wordprocessingInk" xmlns:wne="http://schemas.microsoft.com/office/word/2006/wordml" xmlns:wps="http://schemas.microsoft.com/office/word/2010/wordprocessingShape" mc:Ignorable="w14 w15 w16se w16cid w16 w16cex w16sdtdh w16sdtfl w16du wp14">
   <w:endnote w:type="separator" w:id="-1">
     <w:p>
-      <w:pPr>
-        <w:spacing w:after="0" w:line="240" w:lineRule="auto"/>
-      </w:pPr>
-      <w:r>
-        <w:rPr>
-          <w:rStyle w:val="EndnoteReference"/>
-        </w:rPr>
-        <w:endnoteRef/>
-      </w:r>
       <w:r>
         <w:separator/>
       </w:r>
@@ -1789,15 +1788,6 @@
   </w:endnote>
   <w:endnote w:type="continuationSeparator" w:id="0">
     <w:p>
-      <w:pPr>
-        <w:spacing w:after="0" w:line="240" w:lineRule="auto"/>
-      </w:pPr>
-      <w:r>
-        <w:rPr>
-          <w:rStyle w:val="EndnoteReference"/>
-        </w:rPr>
-        <w:endnoteRef/>
-      </w:r>
       <w:r>
         <w:continuationSeparator/>
       </w:r>
@@ -1807,18 +1797,9 @@
 </file>
 
 <file path=word/footnotes.xml><?xml version="1.0" encoding="utf-8"?>
-<w:footnotes xmlns:wpc="http://schemas.microsoft.com/office/word/2010/wordprocessingCanvas" xmlns:mc="http://schemas.openxmlformats.org/markup-compatibility/2006" xmlns:o="urn:schemas-microsoft-com:office:office" xmlns:r="http://schemas.openxmlformats.org/officeDocument/2006/relationships" xmlns:m="http://schemas.openxmlformats.org/officeDocument/2006/math" xmlns:v="urn:schemas-microsoft-com:vml" xmlns:wp14="http://schemas.microsoft.com/office/word/2010/wordprocessingDrawing" xmlns:wp="http://schemas.openxmlformats.org/drawingml/2006/wordprocessingDrawing" xmlns:w10="urn:schemas-microsoft-com:office:word" xmlns:w="http://schemas.openxmlformats.org/wordprocessingml/2006/main" xmlns:w14="http://schemas.microsoft.com/office/word/2010/wordml" xmlns:w15="http://schemas.microsoft.com/office/word/2012/wordml" xmlns:wpg="http://schemas.microsoft.com/office/word/2010/wordprocessingGroup" xmlns:wpi="http://schemas.microsoft.com/office/word/2010/wordprocessingInk" xmlns:wne="http://schemas.microsoft.com/office/word/2006/wordml" xmlns:wps="http://schemas.microsoft.com/office/word/2010/wordprocessingShape" mc:Ignorable="w14 w15 wp14">
+<w:footnotes xmlns:wpc="http://schemas.microsoft.com/office/word/2010/wordprocessingCanvas" xmlns:cx="http://schemas.microsoft.com/office/drawing/2014/chartex" xmlns:cx1="http://schemas.microsoft.com/office/drawing/2015/9/8/chartex" xmlns:cx2="http://schemas.microsoft.com/office/drawing/2015/10/21/chartex" xmlns:cx3="http://schemas.microsoft.com/office/drawing/2016/5/9/chartex" xmlns:cx4="http://schemas.microsoft.com/office/drawing/2016/5/10/chartex" xmlns:cx5="http://schemas.microsoft.com/office/drawing/2016/5/11/chartex" xmlns:cx6="http://schemas.microsoft.com/office/drawing/2016/5/12/chartex" xmlns:cx7="http://schemas.microsoft.com/office/drawing/2016/5/13/chartex" xmlns:cx8="http://schemas.microsoft.com/office/drawing/2016/5/14/chartex" xmlns:mc="http://schemas.openxmlformats.org/markup-compatibility/2006" xmlns:aink="http://schemas.microsoft.com/office/drawing/2016/ink" xmlns:am3d="http://schemas.microsoft.com/office/drawing/2017/model3d" xmlns:o="urn:schemas-microsoft-com:office:office" xmlns:oel="http://schemas.microsoft.com/office/2019/extlst" xmlns:r="http://schemas.openxmlformats.org/officeDocument/2006/relationships" xmlns:m="http://schemas.openxmlformats.org/officeDocument/2006/math" xmlns:v="urn:schemas-microsoft-com:vml" xmlns:wp14="http://schemas.microsoft.com/office/word/2010/wordprocessingDrawing" xmlns:wp="http://schemas.openxmlformats.org/drawingml/2006/wordprocessingDrawing" xmlns:w10="urn:schemas-microsoft-com:office:word" xmlns:w="http://schemas.openxmlformats.org/wordprocessingml/2006/main" xmlns:w14="http://schemas.microsoft.com/office/word/2010/wordml" xmlns:w15="http://schemas.microsoft.com/office/word/2012/wordml" xmlns:w16cex="http://schemas.microsoft.com/office/word/2018/wordml/cex" xmlns:w16cid="http://schemas.microsoft.com/office/word/2016/wordml/cid" xmlns:w16="http://schemas.microsoft.com/office/word/2018/wordml" xmlns:w16du="http://schemas.microsoft.com/office/word/2023/wordml/word16du" xmlns:w16sdtdh="http://schemas.microsoft.com/office/word/2020/wordml/sdtdatahash" xmlns:w16sdtfl="http://schemas.microsoft.com/office/word/2024/wordml/sdtformatlock" xmlns:w16se="http://schemas.microsoft.com/office/word/2015/wordml/symex" xmlns:wpg="http://schemas.microsoft.com/office/word/2010/wordprocessingGroup" xmlns:wpi="http://schemas.microsoft.com/office/word/2010/wordprocessingInk" xmlns:wne="http://schemas.microsoft.com/office/word/2006/wordml" xmlns:wps="http://schemas.microsoft.com/office/word/2010/wordprocessingShape" mc:Ignorable="w14 w15 w16se w16cid w16 w16cex w16sdtdh w16sdtfl w16du wp14">
   <w:footnote w:type="separator" w:id="-1">
     <w:p>
-      <w:pPr>
-        <w:spacing w:after="0" w:line="240" w:lineRule="auto"/>
-      </w:pPr>
-      <w:r>
-        <w:rPr>
-          <w:rStyle w:val="FootnoteReference"/>
-        </w:rPr>
-        <w:footnoteRef/>
-      </w:r>
       <w:r>
         <w:separator/>
       </w:r>
@@ -1826,15 +1807,6 @@
   </w:footnote>
   <w:footnote w:type="continuationSeparator" w:id="0">
     <w:p>
-      <w:pPr>
-        <w:spacing w:after="0" w:line="240" w:lineRule="auto"/>
-      </w:pPr>
-      <w:r>
-        <w:rPr>
-          <w:rStyle w:val="FootnoteReference"/>
-        </w:rPr>
-        <w:footnoteRef/>
-      </w:r>
       <w:r>
         <w:continuationSeparator/>
       </w:r>
@@ -1844,20 +1816,23 @@
 </file>
 
 <file path=word/header1.xml><?xml version="1.0" encoding="utf-8"?>
-<w:hdr xmlns:wpc="http://schemas.microsoft.com/office/word/2010/wordprocessingCanvas" xmlns:mc="http://schemas.openxmlformats.org/markup-compatibility/2006" xmlns:o="urn:schemas-microsoft-com:office:office" xmlns:r="http://schemas.openxmlformats.org/officeDocument/2006/relationships" xmlns:m="http://schemas.openxmlformats.org/officeDocument/2006/math" xmlns:v="urn:schemas-microsoft-com:vml" xmlns:wp14="http://schemas.microsoft.com/office/word/2010/wordprocessingDrawing" xmlns:wp="http://schemas.openxmlformats.org/drawingml/2006/wordprocessingDrawing" xmlns:w10="urn:schemas-microsoft-com:office:word" xmlns:w="http://schemas.openxmlformats.org/wordprocessingml/2006/main" xmlns:w14="http://schemas.microsoft.com/office/word/2010/wordml" xmlns:w15="http://schemas.microsoft.com/office/word/2012/wordml" xmlns:wpg="http://schemas.microsoft.com/office/word/2010/wordprocessingGroup" xmlns:wpi="http://schemas.microsoft.com/office/word/2010/wordprocessingInk" xmlns:wne="http://schemas.microsoft.com/office/word/2006/wordml" xmlns:wps="http://schemas.microsoft.com/office/word/2010/wordprocessingShape" xmlns:cx="http://schemas.microsoft.com/office/drawing/2014/chartex" xmlns:cx1="http://schemas.microsoft.com/office/drawing/2015/9/8/chartex" xmlns:cx2="http://schemas.microsoft.com/office/drawing/2015/10/21/chartex" xmlns:cx3="http://schemas.microsoft.com/office/drawing/2016/5/9/chartex" xmlns:cx4="http://schemas.microsoft.com/office/drawing/2016/5/10/chartex" xmlns:cx5="http://schemas.microsoft.com/office/drawing/2016/5/11/chartex" xmlns:cx6="http://schemas.microsoft.com/office/drawing/2016/5/12/chartex" xmlns:cx7="http://schemas.microsoft.com/office/drawing/2016/5/13/chartex" xmlns:cx8="http://schemas.microsoft.com/office/drawing/2016/5/14/chartex" xmlns:w16cid="http://schemas.microsoft.com/office/word/2016/wordml/cid" xmlns:w16se="http://schemas.microsoft.com/office/word/2015/wordml/symex">
+<w:hdr xmlns:wpc="http://schemas.microsoft.com/office/word/2010/wordprocessingCanvas" xmlns:cx="http://schemas.microsoft.com/office/drawing/2014/chartex" xmlns:cx1="http://schemas.microsoft.com/office/drawing/2015/9/8/chartex" xmlns:cx2="http://schemas.microsoft.com/office/drawing/2015/10/21/chartex" xmlns:cx3="http://schemas.microsoft.com/office/drawing/2016/5/9/chartex" xmlns:cx4="http://schemas.microsoft.com/office/drawing/2016/5/10/chartex" xmlns:cx5="http://schemas.microsoft.com/office/drawing/2016/5/11/chartex" xmlns:cx6="http://schemas.microsoft.com/office/drawing/2016/5/12/chartex" xmlns:cx7="http://schemas.microsoft.com/office/drawing/2016/5/13/chartex" xmlns:cx8="http://schemas.microsoft.com/office/drawing/2016/5/14/chartex" xmlns:mc="http://schemas.openxmlformats.org/markup-compatibility/2006" xmlns:aink="http://schemas.microsoft.com/office/drawing/2016/ink" xmlns:am3d="http://schemas.microsoft.com/office/drawing/2017/model3d" xmlns:o="urn:schemas-microsoft-com:office:office" xmlns:oel="http://schemas.microsoft.com/office/2019/extlst" xmlns:r="http://schemas.openxmlformats.org/officeDocument/2006/relationships" xmlns:m="http://schemas.openxmlformats.org/officeDocument/2006/math" xmlns:v="urn:schemas-microsoft-com:vml" xmlns:wp14="http://schemas.microsoft.com/office/word/2010/wordprocessingDrawing" xmlns:wp="http://schemas.openxmlformats.org/drawingml/2006/wordprocessingDrawing" xmlns:w10="urn:schemas-microsoft-com:office:word" xmlns:w="http://schemas.openxmlformats.org/wordprocessingml/2006/main" xmlns:w14="http://schemas.microsoft.com/office/word/2010/wordml" xmlns:w15="http://schemas.microsoft.com/office/word/2012/wordml" xmlns:w16cex="http://schemas.microsoft.com/office/word/2018/wordml/cex" xmlns:w16cid="http://schemas.microsoft.com/office/word/2016/wordml/cid" xmlns:w16="http://schemas.microsoft.com/office/word/2018/wordml" xmlns:w16du="http://schemas.microsoft.com/office/word/2023/wordml/word16du" xmlns:w16sdtdh="http://schemas.microsoft.com/office/word/2020/wordml/sdtdatahash" xmlns:w16sdtfl="http://schemas.microsoft.com/office/word/2024/wordml/sdtformatlock" xmlns:w16se="http://schemas.microsoft.com/office/word/2015/wordml/symex" xmlns:wpg="http://schemas.microsoft.com/office/word/2010/wordprocessingGroup" xmlns:wpi="http://schemas.microsoft.com/office/word/2010/wordprocessingInk" xmlns:wne="http://schemas.microsoft.com/office/word/2006/wordml" xmlns:wps="http://schemas.microsoft.com/office/word/2010/wordprocessingShape" mc:Ignorable="w14 w15 w16se w16cid w16 w16cex w16sdtdh w16sdtfl w16du wp14">
   <w:p>
     <w:pPr>
       <w:pBdr>
-        <w:bottom w:val="single" w:color="CCCCCC" w:sz="6" w:space="4"/>
+        <w:bottom w:val="single" w:sz="6" w:space="4" w:color="CCCCCC"/>
       </w:pBdr>
       <w:spacing w:after="40"/>
     </w:pPr>
     <w:r>
+      <w:rPr>
+        <w:noProof/>
+      </w:rPr>
       <w:drawing>
-        <wp:inline distT="0" distB="0" distL="0" distR="0">
+        <wp:inline distT="0" distB="0" distL="0" distR="0" wp14:anchorId="0480206B" wp14:editId="42685BE6">
           <wp:extent cx="400050" cy="361950"/>
-          <wp:effectExtent t="0" r="0" b="0" l="0"/>
-          <wp:docPr id="1" name="logo" descr="logo" title="logo"/>
+          <wp:effectExtent l="0" t="0" r="0" b="0"/>
+          <wp:docPr id="2018673961" name="logo" descr="logo" title="logo"/>
           <wp:cNvGraphicFramePr>
             <a:graphicFrameLocks xmlns:a="http://schemas.openxmlformats.org/drawingml/2006/main" noChangeAspect="1"/>
           </wp:cNvGraphicFramePr>
@@ -1865,13 +1840,13 @@
             <a:graphicData uri="http://schemas.openxmlformats.org/drawingml/2006/picture">
               <pic:pic xmlns:pic="http://schemas.openxmlformats.org/drawingml/2006/picture">
                 <pic:nvPicPr>
-                  <pic:cNvPr id="0" name="" descr=""/>
+                  <pic:cNvPr id="0" name=""/>
                   <pic:cNvPicPr>
                     <a:picLocks noChangeAspect="1" noChangeArrowheads="1"/>
                   </pic:cNvPicPr>
                 </pic:nvPicPr>
                 <pic:blipFill>
-                  <a:blip r:embed="rId0" cstate="none"/>
+                  <a:blip r:embed="rId1"/>
                   <a:srcRect/>
                   <a:stretch>
                     <a:fillRect/>
@@ -1903,7 +1878,7 @@
         <w:sz w:val="18"/>
         <w:szCs w:val="18"/>
       </w:rPr>
-      <w:t xml:space="preserve">HƯỚNG DẪN NHẬP LIỆU BẰNG EXCEL</w:t>
+      <w:t>HƯỚNG DẪN NHẬP LIỆU BẰNG EXCEL</w:t>
     </w:r>
     <w:r>
       <w:rPr>
@@ -1918,10 +1893,174 @@
 </file>
 
 <file path=word/numbering.xml><?xml version="1.0" encoding="utf-8"?>
-<w:numbering xmlns:wpc="http://schemas.microsoft.com/office/word/2010/wordprocessingCanvas" xmlns:mc="http://schemas.openxmlformats.org/markup-compatibility/2006" xmlns:o="urn:schemas-microsoft-com:office:office" xmlns:r="http://schemas.openxmlformats.org/officeDocument/2006/relationships" xmlns:m="http://schemas.openxmlformats.org/officeDocument/2006/math" xmlns:v="urn:schemas-microsoft-com:vml" xmlns:wp14="http://schemas.microsoft.com/office/word/2010/wordprocessingDrawing" xmlns:wp="http://schemas.openxmlformats.org/drawingml/2006/wordprocessingDrawing" xmlns:w10="urn:schemas-microsoft-com:office:word" xmlns:w="http://schemas.openxmlformats.org/wordprocessingml/2006/main" xmlns:w14="http://schemas.microsoft.com/office/word/2010/wordml" xmlns:w15="http://schemas.microsoft.com/office/word/2012/wordml" xmlns:wpg="http://schemas.microsoft.com/office/word/2010/wordprocessingGroup" xmlns:wpi="http://schemas.microsoft.com/office/word/2010/wordprocessingInk" xmlns:wne="http://schemas.microsoft.com/office/word/2006/wordml" xmlns:wps="http://schemas.microsoft.com/office/word/2010/wordprocessingShape" mc:Ignorable="w14 w15 wp14">
+<w:numbering xmlns:wpc="http://schemas.microsoft.com/office/word/2010/wordprocessingCanvas" xmlns:cx="http://schemas.microsoft.com/office/drawing/2014/chartex" xmlns:cx1="http://schemas.microsoft.com/office/drawing/2015/9/8/chartex" xmlns:cx2="http://schemas.microsoft.com/office/drawing/2015/10/21/chartex" xmlns:cx3="http://schemas.microsoft.com/office/drawing/2016/5/9/chartex" xmlns:cx4="http://schemas.microsoft.com/office/drawing/2016/5/10/chartex" xmlns:cx5="http://schemas.microsoft.com/office/drawing/2016/5/11/chartex" xmlns:cx6="http://schemas.microsoft.com/office/drawing/2016/5/12/chartex" xmlns:cx7="http://schemas.microsoft.com/office/drawing/2016/5/13/chartex" xmlns:cx8="http://schemas.microsoft.com/office/drawing/2016/5/14/chartex" xmlns:mc="http://schemas.openxmlformats.org/markup-compatibility/2006" xmlns:aink="http://schemas.microsoft.com/office/drawing/2016/ink" xmlns:am3d="http://schemas.microsoft.com/office/drawing/2017/model3d" xmlns:o="urn:schemas-microsoft-com:office:office" xmlns:oel="http://schemas.microsoft.com/office/2019/extlst" xmlns:r="http://schemas.openxmlformats.org/officeDocument/2006/relationships" xmlns:m="http://schemas.openxmlformats.org/officeDocument/2006/math" xmlns:v="urn:schemas-microsoft-com:vml" xmlns:wp14="http://schemas.microsoft.com/office/word/2010/wordprocessingDrawing" xmlns:wp="http://schemas.openxmlformats.org/drawingml/2006/wordprocessingDrawing" xmlns:w10="urn:schemas-microsoft-com:office:word" xmlns:w="http://schemas.openxmlformats.org/wordprocessingml/2006/main" xmlns:w14="http://schemas.microsoft.com/office/word/2010/wordml" xmlns:w15="http://schemas.microsoft.com/office/word/2012/wordml" xmlns:w16cex="http://schemas.microsoft.com/office/word/2018/wordml/cex" xmlns:w16cid="http://schemas.microsoft.com/office/word/2016/wordml/cid" xmlns:w16="http://schemas.microsoft.com/office/word/2018/wordml" xmlns:w16du="http://schemas.microsoft.com/office/word/2023/wordml/word16du" xmlns:w16sdtdh="http://schemas.microsoft.com/office/word/2020/wordml/sdtdatahash" xmlns:w16sdtfl="http://schemas.microsoft.com/office/word/2024/wordml/sdtformatlock" xmlns:w16se="http://schemas.microsoft.com/office/word/2015/wordml/symex" xmlns:wpg="http://schemas.microsoft.com/office/word/2010/wordprocessingGroup" xmlns:wpi="http://schemas.microsoft.com/office/word/2010/wordprocessingInk" xmlns:wne="http://schemas.microsoft.com/office/word/2006/wordml" xmlns:wps="http://schemas.microsoft.com/office/word/2010/wordprocessingShape" mc:Ignorable="w14 w15 w16se w16cid w16 w16cex w16sdtdh w16sdtfl w16du wp14">
+  <w:abstractNum w:abstractNumId="0" w15:restartNumberingAfterBreak="0">
+    <w:nsid w:val="057F0E53"/>
+    <w:multiLevelType w:val="hybridMultilevel"/>
+    <w:tmpl w:val="688668C0"/>
+    <w:lvl w:ilvl="0" w:tplc="1DD25CB6">
+      <w:start w:val="1"/>
+      <w:numFmt w:val="decimal"/>
+      <w:lvlText w:val="%1."/>
+      <w:lvlJc w:val="left"/>
+      <w:pPr>
+        <w:ind w:left="620" w:hanging="360"/>
+      </w:pPr>
+    </w:lvl>
+    <w:lvl w:ilvl="1" w:tplc="153056E8">
+      <w:numFmt w:val="decimal"/>
+      <w:lvlText w:val=""/>
+      <w:lvlJc w:val="left"/>
+    </w:lvl>
+    <w:lvl w:ilvl="2" w:tplc="9048BDB0">
+      <w:numFmt w:val="decimal"/>
+      <w:lvlText w:val=""/>
+      <w:lvlJc w:val="left"/>
+    </w:lvl>
+    <w:lvl w:ilvl="3" w:tplc="8076BB40">
+      <w:numFmt w:val="decimal"/>
+      <w:lvlText w:val=""/>
+      <w:lvlJc w:val="left"/>
+    </w:lvl>
+    <w:lvl w:ilvl="4" w:tplc="FAA63A6C">
+      <w:numFmt w:val="decimal"/>
+      <w:lvlText w:val=""/>
+      <w:lvlJc w:val="left"/>
+    </w:lvl>
+    <w:lvl w:ilvl="5" w:tplc="C85CE440">
+      <w:numFmt w:val="decimal"/>
+      <w:lvlText w:val=""/>
+      <w:lvlJc w:val="left"/>
+    </w:lvl>
+    <w:lvl w:ilvl="6" w:tplc="EA2C3E68">
+      <w:numFmt w:val="decimal"/>
+      <w:lvlText w:val=""/>
+      <w:lvlJc w:val="left"/>
+    </w:lvl>
+    <w:lvl w:ilvl="7" w:tplc="9550CC52">
+      <w:numFmt w:val="decimal"/>
+      <w:lvlText w:val=""/>
+      <w:lvlJc w:val="left"/>
+    </w:lvl>
+    <w:lvl w:ilvl="8" w:tplc="1632D324">
+      <w:numFmt w:val="decimal"/>
+      <w:lvlText w:val=""/>
+      <w:lvlJc w:val="left"/>
+    </w:lvl>
+  </w:abstractNum>
   <w:abstractNum w:abstractNumId="1" w15:restartNumberingAfterBreak="0">
+    <w:nsid w:val="12172EB9"/>
     <w:multiLevelType w:val="hybridMultilevel"/>
-    <w:lvl w:ilvl="0" w15:tentative="1">
+    <w:tmpl w:val="4AA88C62"/>
+    <w:lvl w:ilvl="0" w:tplc="33D01FCA">
+      <w:start w:val="1"/>
+      <w:numFmt w:val="decimal"/>
+      <w:lvlText w:val="%1."/>
+      <w:lvlJc w:val="left"/>
+      <w:pPr>
+        <w:ind w:left="620" w:hanging="360"/>
+      </w:pPr>
+    </w:lvl>
+    <w:lvl w:ilvl="1" w:tplc="007A7ED4">
+      <w:numFmt w:val="decimal"/>
+      <w:lvlText w:val=""/>
+      <w:lvlJc w:val="left"/>
+    </w:lvl>
+    <w:lvl w:ilvl="2" w:tplc="20B8B2A0">
+      <w:numFmt w:val="decimal"/>
+      <w:lvlText w:val=""/>
+      <w:lvlJc w:val="left"/>
+    </w:lvl>
+    <w:lvl w:ilvl="3" w:tplc="1DE2AEC6">
+      <w:numFmt w:val="decimal"/>
+      <w:lvlText w:val=""/>
+      <w:lvlJc w:val="left"/>
+    </w:lvl>
+    <w:lvl w:ilvl="4" w:tplc="4F827F48">
+      <w:numFmt w:val="decimal"/>
+      <w:lvlText w:val=""/>
+      <w:lvlJc w:val="left"/>
+    </w:lvl>
+    <w:lvl w:ilvl="5" w:tplc="76C836F4">
+      <w:numFmt w:val="decimal"/>
+      <w:lvlText w:val=""/>
+      <w:lvlJc w:val="left"/>
+    </w:lvl>
+    <w:lvl w:ilvl="6" w:tplc="BEB26E22">
+      <w:numFmt w:val="decimal"/>
+      <w:lvlText w:val=""/>
+      <w:lvlJc w:val="left"/>
+    </w:lvl>
+    <w:lvl w:ilvl="7" w:tplc="AE22BF7A">
+      <w:numFmt w:val="decimal"/>
+      <w:lvlText w:val=""/>
+      <w:lvlJc w:val="left"/>
+    </w:lvl>
+    <w:lvl w:ilvl="8" w:tplc="4AA066BC">
+      <w:numFmt w:val="decimal"/>
+      <w:lvlText w:val=""/>
+      <w:lvlJc w:val="left"/>
+    </w:lvl>
+  </w:abstractNum>
+  <w:abstractNum w:abstractNumId="2" w15:restartNumberingAfterBreak="0">
+    <w:nsid w:val="39401215"/>
+    <w:multiLevelType w:val="hybridMultilevel"/>
+    <w:tmpl w:val="BF500854"/>
+    <w:lvl w:ilvl="0" w:tplc="CD886392">
+      <w:start w:val="1"/>
+      <w:numFmt w:val="decimal"/>
+      <w:lvlText w:val="%1."/>
+      <w:lvlJc w:val="left"/>
+      <w:pPr>
+        <w:ind w:left="620" w:hanging="360"/>
+      </w:pPr>
+    </w:lvl>
+    <w:lvl w:ilvl="1" w:tplc="67EADD26">
+      <w:numFmt w:val="decimal"/>
+      <w:lvlText w:val=""/>
+      <w:lvlJc w:val="left"/>
+    </w:lvl>
+    <w:lvl w:ilvl="2" w:tplc="AC38562A">
+      <w:numFmt w:val="decimal"/>
+      <w:lvlText w:val=""/>
+      <w:lvlJc w:val="left"/>
+    </w:lvl>
+    <w:lvl w:ilvl="3" w:tplc="1AFC9870">
+      <w:numFmt w:val="decimal"/>
+      <w:lvlText w:val=""/>
+      <w:lvlJc w:val="left"/>
+    </w:lvl>
+    <w:lvl w:ilvl="4" w:tplc="840E7C3A">
+      <w:numFmt w:val="decimal"/>
+      <w:lvlText w:val=""/>
+      <w:lvlJc w:val="left"/>
+    </w:lvl>
+    <w:lvl w:ilvl="5" w:tplc="353A45B6">
+      <w:numFmt w:val="decimal"/>
+      <w:lvlText w:val=""/>
+      <w:lvlJc w:val="left"/>
+    </w:lvl>
+    <w:lvl w:ilvl="6" w:tplc="DC74EB32">
+      <w:numFmt w:val="decimal"/>
+      <w:lvlText w:val=""/>
+      <w:lvlJc w:val="left"/>
+    </w:lvl>
+    <w:lvl w:ilvl="7" w:tplc="7CEC051A">
+      <w:numFmt w:val="decimal"/>
+      <w:lvlText w:val=""/>
+      <w:lvlJc w:val="left"/>
+    </w:lvl>
+    <w:lvl w:ilvl="8" w:tplc="242029C6">
+      <w:numFmt w:val="decimal"/>
+      <w:lvlText w:val=""/>
+      <w:lvlJc w:val="left"/>
+    </w:lvl>
+  </w:abstractNum>
+  <w:abstractNum w:abstractNumId="3" w15:restartNumberingAfterBreak="0">
+    <w:nsid w:val="4CB50472"/>
+    <w:multiLevelType w:val="hybridMultilevel"/>
+    <w:tmpl w:val="92345C54"/>
+    <w:lvl w:ilvl="0" w:tplc="59128442">
       <w:start w:val="1"/>
       <w:numFmt w:val="bullet"/>
       <w:lvlText w:val="●"/>
@@ -1930,7 +2069,7 @@
         <w:ind w:left="720" w:hanging="360"/>
       </w:pPr>
     </w:lvl>
-    <w:lvl w:ilvl="1" w15:tentative="1">
+    <w:lvl w:ilvl="1" w:tplc="46D277A8">
       <w:start w:val="1"/>
       <w:numFmt w:val="bullet"/>
       <w:lvlText w:val="○"/>
@@ -1939,7 +2078,7 @@
         <w:ind w:left="1440" w:hanging="360"/>
       </w:pPr>
     </w:lvl>
-    <w:lvl w:ilvl="2" w15:tentative="1">
+    <w:lvl w:ilvl="2" w:tplc="E39C9B82">
       <w:start w:val="1"/>
       <w:numFmt w:val="bullet"/>
       <w:lvlText w:val="■"/>
@@ -1948,7 +2087,7 @@
         <w:ind w:left="2160" w:hanging="360"/>
       </w:pPr>
     </w:lvl>
-    <w:lvl w:ilvl="3" w15:tentative="1">
+    <w:lvl w:ilvl="3" w:tplc="5866D704">
       <w:start w:val="1"/>
       <w:numFmt w:val="bullet"/>
       <w:lvlText w:val="●"/>
@@ -1957,7 +2096,7 @@
         <w:ind w:left="2880" w:hanging="360"/>
       </w:pPr>
     </w:lvl>
-    <w:lvl w:ilvl="4" w15:tentative="1">
+    <w:lvl w:ilvl="4" w:tplc="3BF6DE10">
       <w:start w:val="1"/>
       <w:numFmt w:val="bullet"/>
       <w:lvlText w:val="○"/>
@@ -1966,7 +2105,7 @@
         <w:ind w:left="3600" w:hanging="360"/>
       </w:pPr>
     </w:lvl>
-    <w:lvl w:ilvl="5" w15:tentative="1">
+    <w:lvl w:ilvl="5" w:tplc="9C8C2A0E">
       <w:start w:val="1"/>
       <w:numFmt w:val="bullet"/>
       <w:lvlText w:val="■"/>
@@ -1975,7 +2114,7 @@
         <w:ind w:left="4320" w:hanging="360"/>
       </w:pPr>
     </w:lvl>
-    <w:lvl w:ilvl="6" w15:tentative="1">
+    <w:lvl w:ilvl="6" w:tplc="A2FAC76C">
       <w:start w:val="1"/>
       <w:numFmt w:val="bullet"/>
       <w:lvlText w:val="●"/>
@@ -1984,7 +2123,7 @@
         <w:ind w:left="5040" w:hanging="360"/>
       </w:pPr>
     </w:lvl>
-    <w:lvl w:ilvl="7" w15:tentative="1">
+    <w:lvl w:ilvl="7" w:tplc="1F3A679E">
       <w:start w:val="1"/>
       <w:numFmt w:val="bullet"/>
       <w:lvlText w:val="●"/>
@@ -1993,7 +2132,7 @@
         <w:ind w:left="5760" w:hanging="360"/>
       </w:pPr>
     </w:lvl>
-    <w:lvl w:ilvl="8" w15:tentative="1">
+    <w:lvl w:ilvl="8" w:tplc="7AD82C8A">
       <w:start w:val="1"/>
       <w:numFmt w:val="bullet"/>
       <w:lvlText w:val="●"/>
@@ -2003,81 +2142,11 @@
       </w:pPr>
     </w:lvl>
   </w:abstractNum>
-  <w:abstractNum w:abstractNumId="2" w15:restartNumberingAfterBreak="0">
+  <w:abstractNum w:abstractNumId="4" w15:restartNumberingAfterBreak="0">
+    <w:nsid w:val="53F2287E"/>
     <w:multiLevelType w:val="hybridMultilevel"/>
-    <w:lvl w:ilvl="0" w15:tentative="1">
-      <w:start w:val="1"/>
-      <w:numFmt w:val="decimal"/>
-      <w:lvlText w:val="%1."/>
-      <w:lvlJc w:val="left"/>
-      <w:pPr>
-        <w:ind w:left="620" w:hanging="360"/>
-      </w:pPr>
-    </w:lvl>
-  </w:abstractNum>
-  <w:abstractNum w:abstractNumId="3" w15:restartNumberingAfterBreak="0">
-    <w:multiLevelType w:val="hybridMultilevel"/>
-    <w:lvl w:ilvl="0" w15:tentative="1">
-      <w:start w:val="1"/>
-      <w:numFmt w:val="decimal"/>
-      <w:lvlText w:val="%1."/>
-      <w:lvlJc w:val="left"/>
-      <w:pPr>
-        <w:ind w:left="620" w:hanging="360"/>
-      </w:pPr>
-    </w:lvl>
-  </w:abstractNum>
-  <w:abstractNum w:abstractNumId="4" w15:restartNumberingAfterBreak="0">
-    <w:multiLevelType w:val="hybridMultilevel"/>
-    <w:lvl w:ilvl="0" w15:tentative="1">
-      <w:start w:val="1"/>
-      <w:numFmt w:val="decimal"/>
-      <w:lvlText w:val="%1."/>
-      <w:lvlJc w:val="left"/>
-      <w:pPr>
-        <w:ind w:left="620" w:hanging="360"/>
-      </w:pPr>
-    </w:lvl>
-  </w:abstractNum>
-  <w:abstractNum w:abstractNumId="5" w15:restartNumberingAfterBreak="0">
-    <w:multiLevelType w:val="hybridMultilevel"/>
-    <w:lvl w:ilvl="0" w15:tentative="1">
-      <w:start w:val="1"/>
-      <w:numFmt w:val="decimal"/>
-      <w:lvlText w:val="%1."/>
-      <w:lvlJc w:val="left"/>
-      <w:pPr>
-        <w:ind w:left="620" w:hanging="360"/>
-      </w:pPr>
-    </w:lvl>
-  </w:abstractNum>
-  <w:abstractNum w:abstractNumId="6" w15:restartNumberingAfterBreak="0">
-    <w:multiLevelType w:val="hybridMultilevel"/>
-    <w:lvl w:ilvl="0" w15:tentative="1">
-      <w:start w:val="1"/>
-      <w:numFmt w:val="decimal"/>
-      <w:lvlText w:val="%1."/>
-      <w:lvlJc w:val="left"/>
-      <w:pPr>
-        <w:ind w:left="620" w:hanging="360"/>
-      </w:pPr>
-    </w:lvl>
-  </w:abstractNum>
-  <w:abstractNum w:abstractNumId="7" w15:restartNumberingAfterBreak="0">
-    <w:multiLevelType w:val="hybridMultilevel"/>
-    <w:lvl w:ilvl="0" w15:tentative="1">
-      <w:start w:val="1"/>
-      <w:numFmt w:val="decimal"/>
-      <w:lvlText w:val="%1."/>
-      <w:lvlJc w:val="left"/>
-      <w:pPr>
-        <w:ind w:left="620" w:hanging="360"/>
-      </w:pPr>
-    </w:lvl>
-  </w:abstractNum>
-  <w:abstractNum w:abstractNumId="8" w15:restartNumberingAfterBreak="0">
-    <w:multiLevelType w:val="hybridMultilevel"/>
-    <w:lvl w:ilvl="0" w15:tentative="1">
+    <w:tmpl w:val="59DCE1D2"/>
+    <w:lvl w:ilvl="0" w:tplc="F65837E6">
       <w:start w:val="1"/>
       <w:numFmt w:val="bullet"/>
       <w:lvlText w:val="•"/>
@@ -2086,51 +2155,253 @@
         <w:ind w:left="620" w:hanging="360"/>
       </w:pPr>
     </w:lvl>
+    <w:lvl w:ilvl="1" w:tplc="C1EE6BE0">
+      <w:numFmt w:val="decimal"/>
+      <w:lvlText w:val=""/>
+      <w:lvlJc w:val="left"/>
+    </w:lvl>
+    <w:lvl w:ilvl="2" w:tplc="F5FA3F56">
+      <w:numFmt w:val="decimal"/>
+      <w:lvlText w:val=""/>
+      <w:lvlJc w:val="left"/>
+    </w:lvl>
+    <w:lvl w:ilvl="3" w:tplc="3E92ED78">
+      <w:numFmt w:val="decimal"/>
+      <w:lvlText w:val=""/>
+      <w:lvlJc w:val="left"/>
+    </w:lvl>
+    <w:lvl w:ilvl="4" w:tplc="C11A7CDA">
+      <w:numFmt w:val="decimal"/>
+      <w:lvlText w:val=""/>
+      <w:lvlJc w:val="left"/>
+    </w:lvl>
+    <w:lvl w:ilvl="5" w:tplc="1E84011A">
+      <w:numFmt w:val="decimal"/>
+      <w:lvlText w:val=""/>
+      <w:lvlJc w:val="left"/>
+    </w:lvl>
+    <w:lvl w:ilvl="6" w:tplc="7D721490">
+      <w:numFmt w:val="decimal"/>
+      <w:lvlText w:val=""/>
+      <w:lvlJc w:val="left"/>
+    </w:lvl>
+    <w:lvl w:ilvl="7" w:tplc="51C8C28C">
+      <w:numFmt w:val="decimal"/>
+      <w:lvlText w:val=""/>
+      <w:lvlJc w:val="left"/>
+    </w:lvl>
+    <w:lvl w:ilvl="8" w:tplc="2FE021E8">
+      <w:numFmt w:val="decimal"/>
+      <w:lvlText w:val=""/>
+      <w:lvlJc w:val="left"/>
+    </w:lvl>
   </w:abstractNum>
-  <w:num w:numId="1">
+  <w:abstractNum w:abstractNumId="5" w15:restartNumberingAfterBreak="0">
+    <w:nsid w:val="5D696163"/>
+    <w:multiLevelType w:val="hybridMultilevel"/>
+    <w:tmpl w:val="A0BAA37E"/>
+    <w:lvl w:ilvl="0" w:tplc="C8E44672">
+      <w:start w:val="1"/>
+      <w:numFmt w:val="decimal"/>
+      <w:lvlText w:val="%1."/>
+      <w:lvlJc w:val="left"/>
+      <w:pPr>
+        <w:ind w:left="620" w:hanging="360"/>
+      </w:pPr>
+    </w:lvl>
+    <w:lvl w:ilvl="1" w:tplc="E092D6CE">
+      <w:numFmt w:val="decimal"/>
+      <w:lvlText w:val=""/>
+      <w:lvlJc w:val="left"/>
+    </w:lvl>
+    <w:lvl w:ilvl="2" w:tplc="5FBAB614">
+      <w:numFmt w:val="decimal"/>
+      <w:lvlText w:val=""/>
+      <w:lvlJc w:val="left"/>
+    </w:lvl>
+    <w:lvl w:ilvl="3" w:tplc="A326659E">
+      <w:numFmt w:val="decimal"/>
+      <w:lvlText w:val=""/>
+      <w:lvlJc w:val="left"/>
+    </w:lvl>
+    <w:lvl w:ilvl="4" w:tplc="BD62EB7C">
+      <w:numFmt w:val="decimal"/>
+      <w:lvlText w:val=""/>
+      <w:lvlJc w:val="left"/>
+    </w:lvl>
+    <w:lvl w:ilvl="5" w:tplc="9E88631A">
+      <w:numFmt w:val="decimal"/>
+      <w:lvlText w:val=""/>
+      <w:lvlJc w:val="left"/>
+    </w:lvl>
+    <w:lvl w:ilvl="6" w:tplc="631CA8B8">
+      <w:numFmt w:val="decimal"/>
+      <w:lvlText w:val=""/>
+      <w:lvlJc w:val="left"/>
+    </w:lvl>
+    <w:lvl w:ilvl="7" w:tplc="27041500">
+      <w:numFmt w:val="decimal"/>
+      <w:lvlText w:val=""/>
+      <w:lvlJc w:val="left"/>
+    </w:lvl>
+    <w:lvl w:ilvl="8" w:tplc="DEF62814">
+      <w:numFmt w:val="decimal"/>
+      <w:lvlText w:val=""/>
+      <w:lvlJc w:val="left"/>
+    </w:lvl>
+  </w:abstractNum>
+  <w:abstractNum w:abstractNumId="6" w15:restartNumberingAfterBreak="0">
+    <w:nsid w:val="742035FF"/>
+    <w:multiLevelType w:val="hybridMultilevel"/>
+    <w:tmpl w:val="8B523820"/>
+    <w:lvl w:ilvl="0" w:tplc="71B21A7E">
+      <w:start w:val="1"/>
+      <w:numFmt w:val="decimal"/>
+      <w:lvlText w:val="%1."/>
+      <w:lvlJc w:val="left"/>
+      <w:pPr>
+        <w:ind w:left="620" w:hanging="360"/>
+      </w:pPr>
+    </w:lvl>
+    <w:lvl w:ilvl="1" w:tplc="B3EAA07A">
+      <w:numFmt w:val="decimal"/>
+      <w:lvlText w:val=""/>
+      <w:lvlJc w:val="left"/>
+    </w:lvl>
+    <w:lvl w:ilvl="2" w:tplc="F8E02ED4">
+      <w:numFmt w:val="decimal"/>
+      <w:lvlText w:val=""/>
+      <w:lvlJc w:val="left"/>
+    </w:lvl>
+    <w:lvl w:ilvl="3" w:tplc="FE22F9C6">
+      <w:numFmt w:val="decimal"/>
+      <w:lvlText w:val=""/>
+      <w:lvlJc w:val="left"/>
+    </w:lvl>
+    <w:lvl w:ilvl="4" w:tplc="EE48082E">
+      <w:numFmt w:val="decimal"/>
+      <w:lvlText w:val=""/>
+      <w:lvlJc w:val="left"/>
+    </w:lvl>
+    <w:lvl w:ilvl="5" w:tplc="1AB03CA0">
+      <w:numFmt w:val="decimal"/>
+      <w:lvlText w:val=""/>
+      <w:lvlJc w:val="left"/>
+    </w:lvl>
+    <w:lvl w:ilvl="6" w:tplc="4BDE0824">
+      <w:numFmt w:val="decimal"/>
+      <w:lvlText w:val=""/>
+      <w:lvlJc w:val="left"/>
+    </w:lvl>
+    <w:lvl w:ilvl="7" w:tplc="87404C22">
+      <w:numFmt w:val="decimal"/>
+      <w:lvlText w:val=""/>
+      <w:lvlJc w:val="left"/>
+    </w:lvl>
+    <w:lvl w:ilvl="8" w:tplc="11F09B6A">
+      <w:numFmt w:val="decimal"/>
+      <w:lvlText w:val=""/>
+      <w:lvlJc w:val="left"/>
+    </w:lvl>
+  </w:abstractNum>
+  <w:abstractNum w:abstractNumId="7" w15:restartNumberingAfterBreak="0">
+    <w:nsid w:val="7F1B1535"/>
+    <w:multiLevelType w:val="hybridMultilevel"/>
+    <w:tmpl w:val="8CC86B7A"/>
+    <w:lvl w:ilvl="0" w:tplc="B16E7420">
+      <w:start w:val="1"/>
+      <w:numFmt w:val="decimal"/>
+      <w:lvlText w:val="%1."/>
+      <w:lvlJc w:val="left"/>
+      <w:pPr>
+        <w:ind w:left="620" w:hanging="360"/>
+      </w:pPr>
+    </w:lvl>
+    <w:lvl w:ilvl="1" w:tplc="7A405A9E">
+      <w:numFmt w:val="decimal"/>
+      <w:lvlText w:val=""/>
+      <w:lvlJc w:val="left"/>
+    </w:lvl>
+    <w:lvl w:ilvl="2" w:tplc="F45619B4">
+      <w:numFmt w:val="decimal"/>
+      <w:lvlText w:val=""/>
+      <w:lvlJc w:val="left"/>
+    </w:lvl>
+    <w:lvl w:ilvl="3" w:tplc="8BAE220E">
+      <w:numFmt w:val="decimal"/>
+      <w:lvlText w:val=""/>
+      <w:lvlJc w:val="left"/>
+    </w:lvl>
+    <w:lvl w:ilvl="4" w:tplc="C218A286">
+      <w:numFmt w:val="decimal"/>
+      <w:lvlText w:val=""/>
+      <w:lvlJc w:val="left"/>
+    </w:lvl>
+    <w:lvl w:ilvl="5" w:tplc="67AA4946">
+      <w:numFmt w:val="decimal"/>
+      <w:lvlText w:val=""/>
+      <w:lvlJc w:val="left"/>
+    </w:lvl>
+    <w:lvl w:ilvl="6" w:tplc="77A6ABE8">
+      <w:numFmt w:val="decimal"/>
+      <w:lvlText w:val=""/>
+      <w:lvlJc w:val="left"/>
+    </w:lvl>
+    <w:lvl w:ilvl="7" w:tplc="8D488234">
+      <w:numFmt w:val="decimal"/>
+      <w:lvlText w:val=""/>
+      <w:lvlJc w:val="left"/>
+    </w:lvl>
+    <w:lvl w:ilvl="8" w:tplc="7AC44234">
+      <w:numFmt w:val="decimal"/>
+      <w:lvlText w:val=""/>
+      <w:lvlJc w:val="left"/>
+    </w:lvl>
+  </w:abstractNum>
+  <w:num w:numId="1" w16cid:durableId="1116488006">
+    <w:abstractNumId w:val="3"/>
+    <w:lvlOverride w:ilvl="0">
+      <w:startOverride w:val="1"/>
+    </w:lvlOverride>
+  </w:num>
+  <w:num w:numId="2" w16cid:durableId="1799760443">
+    <w:abstractNumId w:val="5"/>
+    <w:lvlOverride w:ilvl="0">
+      <w:startOverride w:val="1"/>
+    </w:lvlOverride>
+  </w:num>
+  <w:num w:numId="3" w16cid:durableId="1690134907">
+    <w:abstractNumId w:val="4"/>
+    <w:lvlOverride w:ilvl="0">
+      <w:startOverride w:val="1"/>
+    </w:lvlOverride>
+  </w:num>
+  <w:num w:numId="4" w16cid:durableId="38092956">
     <w:abstractNumId w:val="1"/>
     <w:lvlOverride w:ilvl="0">
       <w:startOverride w:val="1"/>
     </w:lvlOverride>
   </w:num>
-  <w:num w:numId="2">
+  <w:num w:numId="5" w16cid:durableId="1534996133">
+    <w:abstractNumId w:val="0"/>
+    <w:lvlOverride w:ilvl="0">
+      <w:startOverride w:val="1"/>
+    </w:lvlOverride>
+  </w:num>
+  <w:num w:numId="6" w16cid:durableId="2099324803">
+    <w:abstractNumId w:val="7"/>
+    <w:lvlOverride w:ilvl="0">
+      <w:startOverride w:val="1"/>
+    </w:lvlOverride>
+  </w:num>
+  <w:num w:numId="7" w16cid:durableId="1015811710">
     <w:abstractNumId w:val="2"/>
     <w:lvlOverride w:ilvl="0">
       <w:startOverride w:val="1"/>
     </w:lvlOverride>
   </w:num>
-  <w:num w:numId="3">
-    <w:abstractNumId w:val="8"/>
-    <w:lvlOverride w:ilvl="0">
-      <w:startOverride w:val="1"/>
-    </w:lvlOverride>
-  </w:num>
-  <w:num w:numId="4">
-    <w:abstractNumId w:val="3"/>
-    <w:lvlOverride w:ilvl="0">
-      <w:startOverride w:val="1"/>
-    </w:lvlOverride>
-  </w:num>
-  <w:num w:numId="5">
-    <w:abstractNumId w:val="4"/>
-    <w:lvlOverride w:ilvl="0">
-      <w:startOverride w:val="1"/>
-    </w:lvlOverride>
-  </w:num>
-  <w:num w:numId="6">
-    <w:abstractNumId w:val="5"/>
-    <w:lvlOverride w:ilvl="0">
-      <w:startOverride w:val="1"/>
-    </w:lvlOverride>
-  </w:num>
-  <w:num w:numId="7">
+  <w:num w:numId="8" w16cid:durableId="2136289138">
     <w:abstractNumId w:val="6"/>
-    <w:lvlOverride w:ilvl="0">
-      <w:startOverride w:val="1"/>
-    </w:lvlOverride>
-  </w:num>
-  <w:num w:numId="8">
-    <w:abstractNumId w:val="7"/>
     <w:lvlOverride w:ilvl="0">
       <w:startOverride w:val="1"/>
     </w:lvlOverride>
@@ -2139,54 +2410,442 @@
 </file>
 
 <file path=word/styles.xml><?xml version="1.0" encoding="utf-8"?>
-<w:styles xmlns:mc="http://schemas.openxmlformats.org/markup-compatibility/2006" xmlns:r="http://schemas.openxmlformats.org/officeDocument/2006/relationships" xmlns:w="http://schemas.openxmlformats.org/wordprocessingml/2006/main" xmlns:w14="http://schemas.microsoft.com/office/word/2010/wordml" xmlns:w15="http://schemas.microsoft.com/office/word/2012/wordml" mc:Ignorable="w14 w15">
+<w:styles xmlns:mc="http://schemas.openxmlformats.org/markup-compatibility/2006" xmlns:r="http://schemas.openxmlformats.org/officeDocument/2006/relationships" xmlns:w="http://schemas.openxmlformats.org/wordprocessingml/2006/main" xmlns:w14="http://schemas.microsoft.com/office/word/2010/wordml" xmlns:w15="http://schemas.microsoft.com/office/word/2012/wordml" xmlns:w16cex="http://schemas.microsoft.com/office/word/2018/wordml/cex" xmlns:w16cid="http://schemas.microsoft.com/office/word/2016/wordml/cid" xmlns:w16="http://schemas.microsoft.com/office/word/2018/wordml" xmlns:w16du="http://schemas.microsoft.com/office/word/2023/wordml/word16du" xmlns:w16sdtdh="http://schemas.microsoft.com/office/word/2020/wordml/sdtdatahash" xmlns:w16sdtfl="http://schemas.microsoft.com/office/word/2024/wordml/sdtformatlock" xmlns:w16se="http://schemas.microsoft.com/office/word/2015/wordml/symex" mc:Ignorable="w14 w15 w16se w16cid w16 w16cex w16sdtdh w16sdtfl w16du">
   <w:docDefaults>
     <w:rPrDefault>
       <w:rPr>
-        <w:rFonts w:ascii="Arial" w:cs="Arial" w:eastAsia="Arial" w:hAnsi="Arial"/>
+        <w:rFonts w:ascii="Arial" w:eastAsia="Arial" w:hAnsi="Arial" w:cs="Arial"/>
         <w:sz w:val="22"/>
         <w:szCs w:val="22"/>
+        <w:lang w:val="en-VN" w:eastAsia="zh-CN" w:bidi="ar-SA"/>
       </w:rPr>
     </w:rPrDefault>
     <w:pPrDefault/>
   </w:docDefaults>
-  <w:style w:type="paragraph" w:styleId="Title">
-    <w:name w:val="Title"/>
-    <w:basedOn w:val="Normal"/>
-    <w:next w:val="Normal"/>
+  <w:latentStyles w:defLockedState="0" w:defUIPriority="99" w:defSemiHidden="0" w:defUnhideWhenUsed="0" w:defQFormat="0" w:count="376">
+    <w:lsdException w:name="Normal" w:uiPriority="0" w:qFormat="1"/>
+    <w:lsdException w:name="heading 1" w:uiPriority="9" w:qFormat="1"/>
+    <w:lsdException w:name="heading 2" w:semiHidden="1" w:uiPriority="9" w:unhideWhenUsed="1" w:qFormat="1"/>
+    <w:lsdException w:name="heading 3" w:semiHidden="1" w:uiPriority="9" w:unhideWhenUsed="1" w:qFormat="1"/>
+    <w:lsdException w:name="heading 4" w:semiHidden="1" w:uiPriority="9" w:unhideWhenUsed="1" w:qFormat="1"/>
+    <w:lsdException w:name="heading 5" w:semiHidden="1" w:uiPriority="9" w:unhideWhenUsed="1" w:qFormat="1"/>
+    <w:lsdException w:name="heading 6" w:semiHidden="1" w:uiPriority="9" w:unhideWhenUsed="1" w:qFormat="1"/>
+    <w:lsdException w:name="heading 7" w:semiHidden="1" w:uiPriority="9" w:unhideWhenUsed="1" w:qFormat="1"/>
+    <w:lsdException w:name="heading 8" w:semiHidden="1" w:uiPriority="9" w:unhideWhenUsed="1" w:qFormat="1"/>
+    <w:lsdException w:name="heading 9" w:semiHidden="1" w:uiPriority="9" w:unhideWhenUsed="1" w:qFormat="1"/>
+    <w:lsdException w:name="index 1" w:semiHidden="1" w:unhideWhenUsed="1"/>
+    <w:lsdException w:name="index 2" w:semiHidden="1" w:unhideWhenUsed="1"/>
+    <w:lsdException w:name="index 3" w:semiHidden="1" w:unhideWhenUsed="1"/>
+    <w:lsdException w:name="index 4" w:semiHidden="1" w:unhideWhenUsed="1"/>
+    <w:lsdException w:name="index 5" w:semiHidden="1" w:unhideWhenUsed="1"/>
+    <w:lsdException w:name="index 6" w:semiHidden="1" w:unhideWhenUsed="1"/>
+    <w:lsdException w:name="index 7" w:semiHidden="1" w:unhideWhenUsed="1"/>
+    <w:lsdException w:name="index 8" w:semiHidden="1" w:unhideWhenUsed="1"/>
+    <w:lsdException w:name="index 9" w:semiHidden="1" w:unhideWhenUsed="1"/>
+    <w:lsdException w:name="toc 1" w:semiHidden="1" w:uiPriority="39" w:unhideWhenUsed="1"/>
+    <w:lsdException w:name="toc 2" w:semiHidden="1" w:uiPriority="39" w:unhideWhenUsed="1"/>
+    <w:lsdException w:name="toc 3" w:semiHidden="1" w:uiPriority="39" w:unhideWhenUsed="1"/>
+    <w:lsdException w:name="toc 4" w:semiHidden="1" w:uiPriority="39" w:unhideWhenUsed="1"/>
+    <w:lsdException w:name="toc 5" w:semiHidden="1" w:uiPriority="39" w:unhideWhenUsed="1"/>
+    <w:lsdException w:name="toc 6" w:semiHidden="1" w:uiPriority="39" w:unhideWhenUsed="1"/>
+    <w:lsdException w:name="toc 7" w:semiHidden="1" w:uiPriority="39" w:unhideWhenUsed="1"/>
+    <w:lsdException w:name="toc 8" w:semiHidden="1" w:uiPriority="39" w:unhideWhenUsed="1"/>
+    <w:lsdException w:name="toc 9" w:semiHidden="1" w:uiPriority="39" w:unhideWhenUsed="1"/>
+    <w:lsdException w:name="Normal Indent" w:semiHidden="1" w:unhideWhenUsed="1"/>
+    <w:lsdException w:name="footnote text" w:semiHidden="1" w:unhideWhenUsed="1"/>
+    <w:lsdException w:name="annotation text" w:semiHidden="1" w:unhideWhenUsed="1"/>
+    <w:lsdException w:name="header" w:semiHidden="1" w:unhideWhenUsed="1"/>
+    <w:lsdException w:name="footer" w:semiHidden="1" w:unhideWhenUsed="1"/>
+    <w:lsdException w:name="index heading" w:semiHidden="1" w:unhideWhenUsed="1"/>
+    <w:lsdException w:name="caption" w:semiHidden="1" w:uiPriority="35" w:unhideWhenUsed="1" w:qFormat="1"/>
+    <w:lsdException w:name="table of figures" w:semiHidden="1" w:unhideWhenUsed="1"/>
+    <w:lsdException w:name="envelope address" w:semiHidden="1" w:unhideWhenUsed="1"/>
+    <w:lsdException w:name="envelope return" w:semiHidden="1" w:unhideWhenUsed="1"/>
+    <w:lsdException w:name="footnote reference" w:semiHidden="1" w:unhideWhenUsed="1"/>
+    <w:lsdException w:name="annotation reference" w:semiHidden="1" w:unhideWhenUsed="1"/>
+    <w:lsdException w:name="line number" w:semiHidden="1" w:unhideWhenUsed="1"/>
+    <w:lsdException w:name="page number" w:semiHidden="1" w:unhideWhenUsed="1"/>
+    <w:lsdException w:name="endnote reference" w:semiHidden="1" w:unhideWhenUsed="1"/>
+    <w:lsdException w:name="endnote text" w:semiHidden="1" w:unhideWhenUsed="1"/>
+    <w:lsdException w:name="table of authorities" w:semiHidden="1" w:unhideWhenUsed="1"/>
+    <w:lsdException w:name="macro" w:semiHidden="1" w:unhideWhenUsed="1"/>
+    <w:lsdException w:name="toa heading" w:semiHidden="1" w:unhideWhenUsed="1"/>
+    <w:lsdException w:name="List" w:semiHidden="1" w:unhideWhenUsed="1"/>
+    <w:lsdException w:name="List Bullet" w:semiHidden="1" w:unhideWhenUsed="1"/>
+    <w:lsdException w:name="List Number" w:semiHidden="1" w:unhideWhenUsed="1"/>
+    <w:lsdException w:name="List 2" w:semiHidden="1" w:unhideWhenUsed="1"/>
+    <w:lsdException w:name="List 3" w:semiHidden="1" w:unhideWhenUsed="1"/>
+    <w:lsdException w:name="List 4" w:semiHidden="1" w:unhideWhenUsed="1"/>
+    <w:lsdException w:name="List 5" w:semiHidden="1" w:unhideWhenUsed="1"/>
+    <w:lsdException w:name="List Bullet 2" w:semiHidden="1" w:unhideWhenUsed="1"/>
+    <w:lsdException w:name="List Bullet 3" w:semiHidden="1" w:unhideWhenUsed="1"/>
+    <w:lsdException w:name="List Bullet 4" w:semiHidden="1" w:unhideWhenUsed="1"/>
+    <w:lsdException w:name="List Bullet 5" w:semiHidden="1" w:unhideWhenUsed="1"/>
+    <w:lsdException w:name="List Number 2" w:semiHidden="1" w:unhideWhenUsed="1"/>
+    <w:lsdException w:name="List Number 3" w:semiHidden="1" w:unhideWhenUsed="1"/>
+    <w:lsdException w:name="List Number 4" w:semiHidden="1" w:unhideWhenUsed="1"/>
+    <w:lsdException w:name="List Number 5" w:semiHidden="1" w:unhideWhenUsed="1"/>
+    <w:lsdException w:name="Title" w:uiPriority="10" w:qFormat="1"/>
+    <w:lsdException w:name="Closing" w:semiHidden="1" w:unhideWhenUsed="1"/>
+    <w:lsdException w:name="Signature" w:semiHidden="1" w:unhideWhenUsed="1"/>
+    <w:lsdException w:name="Default Paragraph Font" w:semiHidden="1" w:uiPriority="1" w:unhideWhenUsed="1"/>
+    <w:lsdException w:name="Body Text" w:semiHidden="1" w:unhideWhenUsed="1"/>
+    <w:lsdException w:name="Body Text Indent" w:semiHidden="1" w:unhideWhenUsed="1"/>
+    <w:lsdException w:name="List Continue" w:semiHidden="1" w:unhideWhenUsed="1"/>
+    <w:lsdException w:name="List Continue 2" w:semiHidden="1" w:unhideWhenUsed="1"/>
+    <w:lsdException w:name="List Continue 3" w:semiHidden="1" w:unhideWhenUsed="1"/>
+    <w:lsdException w:name="List Continue 4" w:semiHidden="1" w:unhideWhenUsed="1"/>
+    <w:lsdException w:name="List Continue 5" w:semiHidden="1" w:unhideWhenUsed="1"/>
+    <w:lsdException w:name="Message Header" w:semiHidden="1" w:unhideWhenUsed="1"/>
+    <w:lsdException w:name="Subtitle" w:uiPriority="11" w:qFormat="1"/>
+    <w:lsdException w:name="Salutation" w:semiHidden="1" w:unhideWhenUsed="1"/>
+    <w:lsdException w:name="Date" w:semiHidden="1" w:unhideWhenUsed="1"/>
+    <w:lsdException w:name="Body Text First Indent" w:semiHidden="1" w:unhideWhenUsed="1"/>
+    <w:lsdException w:name="Body Text First Indent 2" w:semiHidden="1" w:unhideWhenUsed="1"/>
+    <w:lsdException w:name="Note Heading" w:semiHidden="1" w:unhideWhenUsed="1"/>
+    <w:lsdException w:name="Body Text 2" w:semiHidden="1" w:unhideWhenUsed="1"/>
+    <w:lsdException w:name="Body Text 3" w:semiHidden="1" w:unhideWhenUsed="1"/>
+    <w:lsdException w:name="Body Text Indent 2" w:semiHidden="1" w:unhideWhenUsed="1"/>
+    <w:lsdException w:name="Body Text Indent 3" w:semiHidden="1" w:unhideWhenUsed="1"/>
+    <w:lsdException w:name="Block Text" w:semiHidden="1" w:unhideWhenUsed="1"/>
+    <w:lsdException w:name="Hyperlink" w:semiHidden="1" w:unhideWhenUsed="1"/>
+    <w:lsdException w:name="FollowedHyperlink" w:semiHidden="1" w:unhideWhenUsed="1"/>
+    <w:lsdException w:name="Strong" w:uiPriority="22" w:qFormat="1"/>
+    <w:lsdException w:name="Emphasis" w:uiPriority="20" w:qFormat="1"/>
+    <w:lsdException w:name="Document Map" w:semiHidden="1" w:unhideWhenUsed="1"/>
+    <w:lsdException w:name="Plain Text" w:semiHidden="1" w:unhideWhenUsed="1"/>
+    <w:lsdException w:name="E-mail Signature" w:semiHidden="1" w:unhideWhenUsed="1"/>
+    <w:lsdException w:name="HTML Top of Form" w:semiHidden="1" w:unhideWhenUsed="1"/>
+    <w:lsdException w:name="HTML Bottom of Form" w:semiHidden="1" w:unhideWhenUsed="1"/>
+    <w:lsdException w:name="Normal (Web)" w:semiHidden="1" w:unhideWhenUsed="1"/>
+    <w:lsdException w:name="HTML Acronym" w:semiHidden="1" w:unhideWhenUsed="1"/>
+    <w:lsdException w:name="HTML Address" w:semiHidden="1" w:unhideWhenUsed="1"/>
+    <w:lsdException w:name="HTML Cite" w:semiHidden="1" w:unhideWhenUsed="1"/>
+    <w:lsdException w:name="HTML Code" w:semiHidden="1" w:unhideWhenUsed="1"/>
+    <w:lsdException w:name="HTML Definition" w:semiHidden="1" w:unhideWhenUsed="1"/>
+    <w:lsdException w:name="HTML Keyboard" w:semiHidden="1" w:unhideWhenUsed="1"/>
+    <w:lsdException w:name="HTML Preformatted" w:semiHidden="1" w:unhideWhenUsed="1"/>
+    <w:lsdException w:name="HTML Sample" w:semiHidden="1" w:unhideWhenUsed="1"/>
+    <w:lsdException w:name="HTML Typewriter" w:semiHidden="1" w:unhideWhenUsed="1"/>
+    <w:lsdException w:name="HTML Variable" w:semiHidden="1" w:unhideWhenUsed="1"/>
+    <w:lsdException w:name="Normal Table" w:semiHidden="1" w:unhideWhenUsed="1"/>
+    <w:lsdException w:name="annotation subject" w:semiHidden="1" w:unhideWhenUsed="1"/>
+    <w:lsdException w:name="No List" w:semiHidden="1" w:unhideWhenUsed="1"/>
+    <w:lsdException w:name="Outline List 1" w:semiHidden="1" w:unhideWhenUsed="1"/>
+    <w:lsdException w:name="Outline List 2" w:semiHidden="1" w:unhideWhenUsed="1"/>
+    <w:lsdException w:name="Outline List 3" w:semiHidden="1" w:unhideWhenUsed="1"/>
+    <w:lsdException w:name="Table Simple 1" w:semiHidden="1" w:unhideWhenUsed="1"/>
+    <w:lsdException w:name="Table Simple 2" w:semiHidden="1" w:unhideWhenUsed="1"/>
+    <w:lsdException w:name="Table Simple 3" w:semiHidden="1" w:unhideWhenUsed="1"/>
+    <w:lsdException w:name="Table Classic 1" w:semiHidden="1" w:unhideWhenUsed="1"/>
+    <w:lsdException w:name="Table Classic 2" w:semiHidden="1" w:unhideWhenUsed="1"/>
+    <w:lsdException w:name="Table Classic 3" w:semiHidden="1" w:unhideWhenUsed="1"/>
+    <w:lsdException w:name="Table Classic 4" w:semiHidden="1" w:unhideWhenUsed="1"/>
+    <w:lsdException w:name="Table Colorful 1" w:semiHidden="1" w:unhideWhenUsed="1"/>
+    <w:lsdException w:name="Table Colorful 2" w:semiHidden="1" w:unhideWhenUsed="1"/>
+    <w:lsdException w:name="Table Colorful 3" w:semiHidden="1" w:unhideWhenUsed="1"/>
+    <w:lsdException w:name="Table Columns 1" w:semiHidden="1" w:unhideWhenUsed="1"/>
+    <w:lsdException w:name="Table Columns 2" w:semiHidden="1" w:unhideWhenUsed="1"/>
+    <w:lsdException w:name="Table Columns 3" w:semiHidden="1" w:unhideWhenUsed="1"/>
+    <w:lsdException w:name="Table Columns 4" w:semiHidden="1" w:unhideWhenUsed="1"/>
+    <w:lsdException w:name="Table Columns 5" w:semiHidden="1" w:unhideWhenUsed="1"/>
+    <w:lsdException w:name="Table Grid 1" w:semiHidden="1" w:unhideWhenUsed="1"/>
+    <w:lsdException w:name="Table Grid 2" w:semiHidden="1" w:unhideWhenUsed="1"/>
+    <w:lsdException w:name="Table Grid 3" w:semiHidden="1" w:unhideWhenUsed="1"/>
+    <w:lsdException w:name="Table Grid 4" w:semiHidden="1" w:unhideWhenUsed="1"/>
+    <w:lsdException w:name="Table Grid 5" w:semiHidden="1" w:unhideWhenUsed="1"/>
+    <w:lsdException w:name="Table Grid 6" w:semiHidden="1" w:unhideWhenUsed="1"/>
+    <w:lsdException w:name="Table Grid 7" w:semiHidden="1" w:unhideWhenUsed="1"/>
+    <w:lsdException w:name="Table Grid 8" w:semiHidden="1" w:unhideWhenUsed="1"/>
+    <w:lsdException w:name="Table List 1" w:semiHidden="1" w:unhideWhenUsed="1"/>
+    <w:lsdException w:name="Table List 2" w:semiHidden="1" w:unhideWhenUsed="1"/>
+    <w:lsdException w:name="Table List 3" w:semiHidden="1" w:unhideWhenUsed="1"/>
+    <w:lsdException w:name="Table List 4" w:semiHidden="1" w:unhideWhenUsed="1"/>
+    <w:lsdException w:name="Table List 5" w:semiHidden="1" w:unhideWhenUsed="1"/>
+    <w:lsdException w:name="Table List 6" w:semiHidden="1" w:unhideWhenUsed="1"/>
+    <w:lsdException w:name="Table List 7" w:semiHidden="1" w:unhideWhenUsed="1"/>
+    <w:lsdException w:name="Table List 8" w:semiHidden="1" w:unhideWhenUsed="1"/>
+    <w:lsdException w:name="Table 3D effects 1" w:semiHidden="1" w:unhideWhenUsed="1"/>
+    <w:lsdException w:name="Table 3D effects 2" w:semiHidden="1" w:unhideWhenUsed="1"/>
+    <w:lsdException w:name="Table 3D effects 3" w:semiHidden="1" w:unhideWhenUsed="1"/>
+    <w:lsdException w:name="Table Contemporary" w:semiHidden="1" w:unhideWhenUsed="1"/>
+    <w:lsdException w:name="Table Elegant" w:semiHidden="1" w:unhideWhenUsed="1"/>
+    <w:lsdException w:name="Table Professional" w:semiHidden="1" w:unhideWhenUsed="1"/>
+    <w:lsdException w:name="Table Subtle 1" w:semiHidden="1" w:unhideWhenUsed="1"/>
+    <w:lsdException w:name="Table Subtle 2" w:semiHidden="1" w:unhideWhenUsed="1"/>
+    <w:lsdException w:name="Table Web 1" w:semiHidden="1" w:unhideWhenUsed="1"/>
+    <w:lsdException w:name="Table Web 2" w:semiHidden="1" w:unhideWhenUsed="1"/>
+    <w:lsdException w:name="Table Web 3" w:semiHidden="1" w:unhideWhenUsed="1"/>
+    <w:lsdException w:name="Balloon Text" w:semiHidden="1" w:unhideWhenUsed="1"/>
+    <w:lsdException w:name="Table Grid" w:uiPriority="39"/>
+    <w:lsdException w:name="Table Theme" w:semiHidden="1" w:unhideWhenUsed="1"/>
+    <w:lsdException w:name="Placeholder Text" w:semiHidden="1"/>
+    <w:lsdException w:name="No Spacing" w:uiPriority="1" w:qFormat="1"/>
+    <w:lsdException w:name="Light Shading" w:uiPriority="60"/>
+    <w:lsdException w:name="Light List" w:uiPriority="61"/>
+    <w:lsdException w:name="Light Grid" w:uiPriority="62"/>
+    <w:lsdException w:name="Medium Shading 1" w:uiPriority="63"/>
+    <w:lsdException w:name="Medium Shading 2" w:uiPriority="64"/>
+    <w:lsdException w:name="Medium List 1" w:uiPriority="65"/>
+    <w:lsdException w:name="Medium List 2" w:uiPriority="66"/>
+    <w:lsdException w:name="Medium Grid 1" w:uiPriority="67"/>
+    <w:lsdException w:name="Medium Grid 2" w:uiPriority="68"/>
+    <w:lsdException w:name="Medium Grid 3" w:uiPriority="69"/>
+    <w:lsdException w:name="Dark List" w:uiPriority="70"/>
+    <w:lsdException w:name="Colorful Shading" w:uiPriority="71"/>
+    <w:lsdException w:name="Colorful List" w:uiPriority="72"/>
+    <w:lsdException w:name="Colorful Grid" w:uiPriority="73"/>
+    <w:lsdException w:name="Light Shading Accent 1" w:uiPriority="60"/>
+    <w:lsdException w:name="Light List Accent 1" w:uiPriority="61"/>
+    <w:lsdException w:name="Light Grid Accent 1" w:uiPriority="62"/>
+    <w:lsdException w:name="Medium Shading 1 Accent 1" w:uiPriority="63"/>
+    <w:lsdException w:name="Medium Shading 2 Accent 1" w:uiPriority="64"/>
+    <w:lsdException w:name="Medium List 1 Accent 1" w:uiPriority="65"/>
+    <w:lsdException w:name="Revision" w:semiHidden="1"/>
+    <w:lsdException w:name="List Paragraph" w:uiPriority="34" w:qFormat="1"/>
+    <w:lsdException w:name="Quote" w:uiPriority="29" w:qFormat="1"/>
+    <w:lsdException w:name="Intense Quote" w:uiPriority="30" w:qFormat="1"/>
+    <w:lsdException w:name="Medium List 2 Accent 1" w:uiPriority="66"/>
+    <w:lsdException w:name="Medium Grid 1 Accent 1" w:uiPriority="67"/>
+    <w:lsdException w:name="Medium Grid 2 Accent 1" w:uiPriority="68"/>
+    <w:lsdException w:name="Medium Grid 3 Accent 1" w:uiPriority="69"/>
+    <w:lsdException w:name="Dark List Accent 1" w:uiPriority="70"/>
+    <w:lsdException w:name="Colorful Shading Accent 1" w:uiPriority="71"/>
+    <w:lsdException w:name="Colorful List Accent 1" w:uiPriority="72"/>
+    <w:lsdException w:name="Colorful Grid Accent 1" w:uiPriority="73"/>
+    <w:lsdException w:name="Light Shading Accent 2" w:uiPriority="60"/>
+    <w:lsdException w:name="Light List Accent 2" w:uiPriority="61"/>
+    <w:lsdException w:name="Light Grid Accent 2" w:uiPriority="62"/>
+    <w:lsdException w:name="Medium Shading 1 Accent 2" w:uiPriority="63"/>
+    <w:lsdException w:name="Medium Shading 2 Accent 2" w:uiPriority="64"/>
+    <w:lsdException w:name="Medium List 1 Accent 2" w:uiPriority="65"/>
+    <w:lsdException w:name="Medium List 2 Accent 2" w:uiPriority="66"/>
+    <w:lsdException w:name="Medium Grid 1 Accent 2" w:uiPriority="67"/>
+    <w:lsdException w:name="Medium Grid 2 Accent 2" w:uiPriority="68"/>
+    <w:lsdException w:name="Medium Grid 3 Accent 2" w:uiPriority="69"/>
+    <w:lsdException w:name="Dark List Accent 2" w:uiPriority="70"/>
+    <w:lsdException w:name="Colorful Shading Accent 2" w:uiPriority="71"/>
+    <w:lsdException w:name="Colorful List Accent 2" w:uiPriority="72"/>
+    <w:lsdException w:name="Colorful Grid Accent 2" w:uiPriority="73"/>
+    <w:lsdException w:name="Light Shading Accent 3" w:uiPriority="60"/>
+    <w:lsdException w:name="Light List Accent 3" w:uiPriority="61"/>
+    <w:lsdException w:name="Light Grid Accent 3" w:uiPriority="62"/>
+    <w:lsdException w:name="Medium Shading 1 Accent 3" w:uiPriority="63"/>
+    <w:lsdException w:name="Medium Shading 2 Accent 3" w:uiPriority="64"/>
+    <w:lsdException w:name="Medium List 1 Accent 3" w:uiPriority="65"/>
+    <w:lsdException w:name="Medium List 2 Accent 3" w:uiPriority="66"/>
+    <w:lsdException w:name="Medium Grid 1 Accent 3" w:uiPriority="67"/>
+    <w:lsdException w:name="Medium Grid 2 Accent 3" w:uiPriority="68"/>
+    <w:lsdException w:name="Medium Grid 3 Accent 3" w:uiPriority="69"/>
+    <w:lsdException w:name="Dark List Accent 3" w:uiPriority="70"/>
+    <w:lsdException w:name="Colorful Shading Accent 3" w:uiPriority="71"/>
+    <w:lsdException w:name="Colorful List Accent 3" w:uiPriority="72"/>
+    <w:lsdException w:name="Colorful Grid Accent 3" w:uiPriority="73"/>
+    <w:lsdException w:name="Light Shading Accent 4" w:uiPriority="60"/>
+    <w:lsdException w:name="Light List Accent 4" w:uiPriority="61"/>
+    <w:lsdException w:name="Light Grid Accent 4" w:uiPriority="62"/>
+    <w:lsdException w:name="Medium Shading 1 Accent 4" w:uiPriority="63"/>
+    <w:lsdException w:name="Medium Shading 2 Accent 4" w:uiPriority="64"/>
+    <w:lsdException w:name="Medium List 1 Accent 4" w:uiPriority="65"/>
+    <w:lsdException w:name="Medium List 2 Accent 4" w:uiPriority="66"/>
+    <w:lsdException w:name="Medium Grid 1 Accent 4" w:uiPriority="67"/>
+    <w:lsdException w:name="Medium Grid 2 Accent 4" w:uiPriority="68"/>
+    <w:lsdException w:name="Medium Grid 3 Accent 4" w:uiPriority="69"/>
+    <w:lsdException w:name="Dark List Accent 4" w:uiPriority="70"/>
+    <w:lsdException w:name="Colorful Shading Accent 4" w:uiPriority="71"/>
+    <w:lsdException w:name="Colorful List Accent 4" w:uiPriority="72"/>
+    <w:lsdException w:name="Colorful Grid Accent 4" w:uiPriority="73"/>
+    <w:lsdException w:name="Light Shading Accent 5" w:uiPriority="60"/>
+    <w:lsdException w:name="Light List Accent 5" w:uiPriority="61"/>
+    <w:lsdException w:name="Light Grid Accent 5" w:uiPriority="62"/>
+    <w:lsdException w:name="Medium Shading 1 Accent 5" w:uiPriority="63"/>
+    <w:lsdException w:name="Medium Shading 2 Accent 5" w:uiPriority="64"/>
+    <w:lsdException w:name="Medium List 1 Accent 5" w:uiPriority="65"/>
+    <w:lsdException w:name="Medium List 2 Accent 5" w:uiPriority="66"/>
+    <w:lsdException w:name="Medium Grid 1 Accent 5" w:uiPriority="67"/>
+    <w:lsdException w:name="Medium Grid 2 Accent 5" w:uiPriority="68"/>
+    <w:lsdException w:name="Medium Grid 3 Accent 5" w:uiPriority="69"/>
+    <w:lsdException w:name="Dark List Accent 5" w:uiPriority="70"/>
+    <w:lsdException w:name="Colorful Shading Accent 5" w:uiPriority="71"/>
+    <w:lsdException w:name="Colorful List Accent 5" w:uiPriority="72"/>
+    <w:lsdException w:name="Colorful Grid Accent 5" w:uiPriority="73"/>
+    <w:lsdException w:name="Light Shading Accent 6" w:uiPriority="60"/>
+    <w:lsdException w:name="Light List Accent 6" w:uiPriority="61"/>
+    <w:lsdException w:name="Light Grid Accent 6" w:uiPriority="62"/>
+    <w:lsdException w:name="Medium Shading 1 Accent 6" w:uiPriority="63"/>
+    <w:lsdException w:name="Medium Shading 2 Accent 6" w:uiPriority="64"/>
+    <w:lsdException w:name="Medium List 1 Accent 6" w:uiPriority="65"/>
+    <w:lsdException w:name="Medium List 2 Accent 6" w:uiPriority="66"/>
+    <w:lsdException w:name="Medium Grid 1 Accent 6" w:uiPriority="67"/>
+    <w:lsdException w:name="Medium Grid 2 Accent 6" w:uiPriority="68"/>
+    <w:lsdException w:name="Medium Grid 3 Accent 6" w:uiPriority="69"/>
+    <w:lsdException w:name="Dark List Accent 6" w:uiPriority="70"/>
+    <w:lsdException w:name="Colorful Shading Accent 6" w:uiPriority="71"/>
+    <w:lsdException w:name="Colorful List Accent 6" w:uiPriority="72"/>
+    <w:lsdException w:name="Colorful Grid Accent 6" w:uiPriority="73"/>
+    <w:lsdException w:name="Subtle Emphasis" w:uiPriority="19" w:qFormat="1"/>
+    <w:lsdException w:name="Intense Emphasis" w:uiPriority="21" w:qFormat="1"/>
+    <w:lsdException w:name="Subtle Reference" w:uiPriority="31" w:qFormat="1"/>
+    <w:lsdException w:name="Intense Reference" w:uiPriority="32" w:qFormat="1"/>
+    <w:lsdException w:name="Book Title" w:uiPriority="33" w:qFormat="1"/>
+    <w:lsdException w:name="Bibliography" w:semiHidden="1" w:uiPriority="37" w:unhideWhenUsed="1"/>
+    <w:lsdException w:name="TOC Heading" w:semiHidden="1" w:uiPriority="39" w:unhideWhenUsed="1" w:qFormat="1"/>
+    <w:lsdException w:name="Plain Table 1" w:uiPriority="41"/>
+    <w:lsdException w:name="Plain Table 2" w:uiPriority="42"/>
+    <w:lsdException w:name="Plain Table 3" w:uiPriority="43"/>
+    <w:lsdException w:name="Plain Table 4" w:uiPriority="44"/>
+    <w:lsdException w:name="Plain Table 5" w:uiPriority="45"/>
+    <w:lsdException w:name="Grid Table Light" w:uiPriority="40"/>
+    <w:lsdException w:name="Grid Table 1 Light" w:uiPriority="46"/>
+    <w:lsdException w:name="Grid Table 2" w:uiPriority="47"/>
+    <w:lsdException w:name="Grid Table 3" w:uiPriority="48"/>
+    <w:lsdException w:name="Grid Table 4" w:uiPriority="49"/>
+    <w:lsdException w:name="Grid Table 5 Dark" w:uiPriority="50"/>
+    <w:lsdException w:name="Grid Table 6 Colorful" w:uiPriority="51"/>
+    <w:lsdException w:name="Grid Table 7 Colorful" w:uiPriority="52"/>
+    <w:lsdException w:name="Grid Table 1 Light Accent 1" w:uiPriority="46"/>
+    <w:lsdException w:name="Grid Table 2 Accent 1" w:uiPriority="47"/>
+    <w:lsdException w:name="Grid Table 3 Accent 1" w:uiPriority="48"/>
+    <w:lsdException w:name="Grid Table 4 Accent 1" w:uiPriority="49"/>
+    <w:lsdException w:name="Grid Table 5 Dark Accent 1" w:uiPriority="50"/>
+    <w:lsdException w:name="Grid Table 6 Colorful Accent 1" w:uiPriority="51"/>
+    <w:lsdException w:name="Grid Table 7 Colorful Accent 1" w:uiPriority="52"/>
+    <w:lsdException w:name="Grid Table 1 Light Accent 2" w:uiPriority="46"/>
+    <w:lsdException w:name="Grid Table 2 Accent 2" w:uiPriority="47"/>
+    <w:lsdException w:name="Grid Table 3 Accent 2" w:uiPriority="48"/>
+    <w:lsdException w:name="Grid Table 4 Accent 2" w:uiPriority="49"/>
+    <w:lsdException w:name="Grid Table 5 Dark Accent 2" w:uiPriority="50"/>
+    <w:lsdException w:name="Grid Table 6 Colorful Accent 2" w:uiPriority="51"/>
+    <w:lsdException w:name="Grid Table 7 Colorful Accent 2" w:uiPriority="52"/>
+    <w:lsdException w:name="Grid Table 1 Light Accent 3" w:uiPriority="46"/>
+    <w:lsdException w:name="Grid Table 2 Accent 3" w:uiPriority="47"/>
+    <w:lsdException w:name="Grid Table 3 Accent 3" w:uiPriority="48"/>
+    <w:lsdException w:name="Grid Table 4 Accent 3" w:uiPriority="49"/>
+    <w:lsdException w:name="Grid Table 5 Dark Accent 3" w:uiPriority="50"/>
+    <w:lsdException w:name="Grid Table 6 Colorful Accent 3" w:uiPriority="51"/>
+    <w:lsdException w:name="Grid Table 7 Colorful Accent 3" w:uiPriority="52"/>
+    <w:lsdException w:name="Grid Table 1 Light Accent 4" w:uiPriority="46"/>
+    <w:lsdException w:name="Grid Table 2 Accent 4" w:uiPriority="47"/>
+    <w:lsdException w:name="Grid Table 3 Accent 4" w:uiPriority="48"/>
+    <w:lsdException w:name="Grid Table 4 Accent 4" w:uiPriority="49"/>
+    <w:lsdException w:name="Grid Table 5 Dark Accent 4" w:uiPriority="50"/>
+    <w:lsdException w:name="Grid Table 6 Colorful Accent 4" w:uiPriority="51"/>
+    <w:lsdException w:name="Grid Table 7 Colorful Accent 4" w:uiPriority="52"/>
+    <w:lsdException w:name="Grid Table 1 Light Accent 5" w:uiPriority="46"/>
+    <w:lsdException w:name="Grid Table 2 Accent 5" w:uiPriority="47"/>
+    <w:lsdException w:name="Grid Table 3 Accent 5" w:uiPriority="48"/>
+    <w:lsdException w:name="Grid Table 4 Accent 5" w:uiPriority="49"/>
+    <w:lsdException w:name="Grid Table 5 Dark Accent 5" w:uiPriority="50"/>
+    <w:lsdException w:name="Grid Table 6 Colorful Accent 5" w:uiPriority="51"/>
+    <w:lsdException w:name="Grid Table 7 Colorful Accent 5" w:uiPriority="52"/>
+    <w:lsdException w:name="Grid Table 1 Light Accent 6" w:uiPriority="46"/>
+    <w:lsdException w:name="Grid Table 2 Accent 6" w:uiPriority="47"/>
+    <w:lsdException w:name="Grid Table 3 Accent 6" w:uiPriority="48"/>
+    <w:lsdException w:name="Grid Table 4 Accent 6" w:uiPriority="49"/>
+    <w:lsdException w:name="Grid Table 5 Dark Accent 6" w:uiPriority="50"/>
+    <w:lsdException w:name="Grid Table 6 Colorful Accent 6" w:uiPriority="51"/>
+    <w:lsdException w:name="Grid Table 7 Colorful Accent 6" w:uiPriority="52"/>
+    <w:lsdException w:name="List Table 1 Light" w:uiPriority="46"/>
+    <w:lsdException w:name="List Table 2" w:uiPriority="47"/>
+    <w:lsdException w:name="List Table 3" w:uiPriority="48"/>
+    <w:lsdException w:name="List Table 4" w:uiPriority="49"/>
+    <w:lsdException w:name="List Table 5 Dark" w:uiPriority="50"/>
+    <w:lsdException w:name="List Table 6 Colorful" w:uiPriority="51"/>
+    <w:lsdException w:name="List Table 7 Colorful" w:uiPriority="52"/>
+    <w:lsdException w:name="List Table 1 Light Accent 1" w:uiPriority="46"/>
+    <w:lsdException w:name="List Table 2 Accent 1" w:uiPriority="47"/>
+    <w:lsdException w:name="List Table 3 Accent 1" w:uiPriority="48"/>
+    <w:lsdException w:name="List Table 4 Accent 1" w:uiPriority="49"/>
+    <w:lsdException w:name="List Table 5 Dark Accent 1" w:uiPriority="50"/>
+    <w:lsdException w:name="List Table 6 Colorful Accent 1" w:uiPriority="51"/>
+    <w:lsdException w:name="List Table 7 Colorful Accent 1" w:uiPriority="52"/>
+    <w:lsdException w:name="List Table 1 Light Accent 2" w:uiPriority="46"/>
+    <w:lsdException w:name="List Table 2 Accent 2" w:uiPriority="47"/>
+    <w:lsdException w:name="List Table 3 Accent 2" w:uiPriority="48"/>
+    <w:lsdException w:name="List Table 4 Accent 2" w:uiPriority="49"/>
+    <w:lsdException w:name="List Table 5 Dark Accent 2" w:uiPriority="50"/>
+    <w:lsdException w:name="List Table 6 Colorful Accent 2" w:uiPriority="51"/>
+    <w:lsdException w:name="List Table 7 Colorful Accent 2" w:uiPriority="52"/>
+    <w:lsdException w:name="List Table 1 Light Accent 3" w:uiPriority="46"/>
+    <w:lsdException w:name="List Table 2 Accent 3" w:uiPriority="47"/>
+    <w:lsdException w:name="List Table 3 Accent 3" w:uiPriority="48"/>
+    <w:lsdException w:name="List Table 4 Accent 3" w:uiPriority="49"/>
+    <w:lsdException w:name="List Table 5 Dark Accent 3" w:uiPriority="50"/>
+    <w:lsdException w:name="List Table 6 Colorful Accent 3" w:uiPriority="51"/>
+    <w:lsdException w:name="List Table 7 Colorful Accent 3" w:uiPriority="52"/>
+    <w:lsdException w:name="List Table 1 Light Accent 4" w:uiPriority="46"/>
+    <w:lsdException w:name="List Table 2 Accent 4" w:uiPriority="47"/>
+    <w:lsdException w:name="List Table 3 Accent 4" w:uiPriority="48"/>
+    <w:lsdException w:name="List Table 4 Accent 4" w:uiPriority="49"/>
+    <w:lsdException w:name="List Table 5 Dark Accent 4" w:uiPriority="50"/>
+    <w:lsdException w:name="List Table 6 Colorful Accent 4" w:uiPriority="51"/>
+    <w:lsdException w:name="List Table 7 Colorful Accent 4" w:uiPriority="52"/>
+    <w:lsdException w:name="List Table 1 Light Accent 5" w:uiPriority="46"/>
+    <w:lsdException w:name="List Table 2 Accent 5" w:uiPriority="47"/>
+    <w:lsdException w:name="List Table 3 Accent 5" w:uiPriority="48"/>
+    <w:lsdException w:name="List Table 4 Accent 5" w:uiPriority="49"/>
+    <w:lsdException w:name="List Table 5 Dark Accent 5" w:uiPriority="50"/>
+    <w:lsdException w:name="List Table 6 Colorful Accent 5" w:uiPriority="51"/>
+    <w:lsdException w:name="List Table 7 Colorful Accent 5" w:uiPriority="52"/>
+    <w:lsdException w:name="List Table 1 Light Accent 6" w:uiPriority="46"/>
+    <w:lsdException w:name="List Table 2 Accent 6" w:uiPriority="47"/>
+    <w:lsdException w:name="List Table 3 Accent 6" w:uiPriority="48"/>
+    <w:lsdException w:name="List Table 4 Accent 6" w:uiPriority="49"/>
+    <w:lsdException w:name="List Table 5 Dark Accent 6" w:uiPriority="50"/>
+    <w:lsdException w:name="List Table 6 Colorful Accent 6" w:uiPriority="51"/>
+    <w:lsdException w:name="List Table 7 Colorful Accent 6" w:uiPriority="52"/>
+    <w:lsdException w:name="Mention" w:semiHidden="1" w:unhideWhenUsed="1"/>
+    <w:lsdException w:name="Smart Hyperlink" w:semiHidden="1" w:unhideWhenUsed="1"/>
+    <w:lsdException w:name="Hashtag" w:semiHidden="1" w:unhideWhenUsed="1"/>
+    <w:lsdException w:name="Unresolved Mention" w:semiHidden="1" w:unhideWhenUsed="1"/>
+    <w:lsdException w:name="Smart Link" w:semiHidden="1" w:unhideWhenUsed="1"/>
+  </w:latentStyles>
+  <w:style w:type="paragraph" w:default="1" w:styleId="Normal">
+    <w:name w:val="Normal"/>
     <w:qFormat/>
-    <w:rPr>
-      <w:sz w:val="56"/>
-      <w:szCs w:val="56"/>
-    </w:rPr>
   </w:style>
   <w:style w:type="paragraph" w:styleId="Heading1">
-    <w:name w:val="Heading 1"/>
-    <w:basedOn w:val="Normal"/>
-    <w:next w:val="Normal"/>
+    <w:name w:val="heading 1"/>
+    <w:uiPriority w:val="9"/>
     <w:qFormat/>
+    <w:pPr>
+      <w:spacing w:before="200" w:after="160"/>
+      <w:outlineLvl w:val="0"/>
+    </w:pPr>
     <w:rPr>
-      <w:color w:val="2E74B5"/>
+      <w:b/>
+      <w:bCs/>
+      <w:color w:val="1F7A4D"/>
       <w:sz w:val="32"/>
       <w:szCs w:val="32"/>
     </w:rPr>
   </w:style>
   <w:style w:type="paragraph" w:styleId="Heading2">
-    <w:name w:val="Heading 2"/>
-    <w:basedOn w:val="Normal"/>
-    <w:next w:val="Normal"/>
+    <w:name w:val="heading 2"/>
+    <w:uiPriority w:val="9"/>
+    <w:unhideWhenUsed/>
     <w:qFormat/>
+    <w:pPr>
+      <w:spacing w:before="160" w:after="120"/>
+      <w:outlineLvl w:val="1"/>
+    </w:pPr>
     <w:rPr>
-      <w:color w:val="2E74B5"/>
+      <w:b/>
+      <w:bCs/>
+      <w:color w:val="C2410C"/>
       <w:sz w:val="26"/>
       <w:szCs w:val="26"/>
     </w:rPr>
   </w:style>
   <w:style w:type="paragraph" w:styleId="Heading3">
-    <w:name w:val="Heading 3"/>
-    <w:basedOn w:val="Normal"/>
-    <w:next w:val="Normal"/>
+    <w:name w:val="heading 3"/>
+    <w:uiPriority w:val="9"/>
+    <w:semiHidden/>
+    <w:unhideWhenUsed/>
     <w:qFormat/>
+    <w:pPr>
+      <w:outlineLvl w:val="2"/>
+    </w:pPr>
     <w:rPr>
       <w:color w:val="1F4D78"/>
       <w:sz w:val="24"/>
@@ -2194,10 +2853,14 @@
     </w:rPr>
   </w:style>
   <w:style w:type="paragraph" w:styleId="Heading4">
-    <w:name w:val="Heading 4"/>
-    <w:basedOn w:val="Normal"/>
-    <w:next w:val="Normal"/>
+    <w:name w:val="heading 4"/>
+    <w:uiPriority w:val="9"/>
+    <w:semiHidden/>
+    <w:unhideWhenUsed/>
     <w:qFormat/>
+    <w:pPr>
+      <w:outlineLvl w:val="3"/>
+    </w:pPr>
     <w:rPr>
       <w:i/>
       <w:iCs/>
@@ -2205,27 +2868,69 @@
     </w:rPr>
   </w:style>
   <w:style w:type="paragraph" w:styleId="Heading5">
-    <w:name w:val="Heading 5"/>
-    <w:basedOn w:val="Normal"/>
-    <w:next w:val="Normal"/>
+    <w:name w:val="heading 5"/>
+    <w:uiPriority w:val="9"/>
+    <w:semiHidden/>
+    <w:unhideWhenUsed/>
     <w:qFormat/>
+    <w:pPr>
+      <w:outlineLvl w:val="4"/>
+    </w:pPr>
     <w:rPr>
       <w:color w:val="2E74B5"/>
     </w:rPr>
   </w:style>
   <w:style w:type="paragraph" w:styleId="Heading6">
-    <w:name w:val="Heading 6"/>
-    <w:basedOn w:val="Normal"/>
-    <w:next w:val="Normal"/>
+    <w:name w:val="heading 6"/>
+    <w:uiPriority w:val="9"/>
+    <w:semiHidden/>
+    <w:unhideWhenUsed/>
     <w:qFormat/>
+    <w:pPr>
+      <w:outlineLvl w:val="5"/>
+    </w:pPr>
     <w:rPr>
       <w:color w:val="1F4D78"/>
     </w:rPr>
   </w:style>
-  <w:style w:type="paragraph" w:styleId="Strong">
-    <w:name w:val="Strong"/>
-    <w:basedOn w:val="Normal"/>
-    <w:next w:val="Normal"/>
+  <w:style w:type="character" w:default="1" w:styleId="DefaultParagraphFont">
+    <w:name w:val="Default Paragraph Font"/>
+    <w:uiPriority w:val="1"/>
+    <w:semiHidden/>
+    <w:unhideWhenUsed/>
+  </w:style>
+  <w:style w:type="table" w:default="1" w:styleId="TableNormal">
+    <w:name w:val="Normal Table"/>
+    <w:uiPriority w:val="99"/>
+    <w:semiHidden/>
+    <w:unhideWhenUsed/>
+    <w:tblPr>
+      <w:tblInd w:w="0" w:type="dxa"/>
+      <w:tblCellMar>
+        <w:top w:w="0" w:type="dxa"/>
+        <w:left w:w="108" w:type="dxa"/>
+        <w:bottom w:w="0" w:type="dxa"/>
+        <w:right w:w="108" w:type="dxa"/>
+      </w:tblCellMar>
+    </w:tblPr>
+  </w:style>
+  <w:style w:type="numbering" w:default="1" w:styleId="NoList">
+    <w:name w:val="No List"/>
+    <w:uiPriority w:val="99"/>
+    <w:semiHidden/>
+    <w:unhideWhenUsed/>
+  </w:style>
+  <w:style w:type="paragraph" w:styleId="Title">
+    <w:name w:val="Title"/>
+    <w:uiPriority w:val="10"/>
+    <w:qFormat/>
+    <w:rPr>
+      <w:sz w:val="56"/>
+      <w:szCs w:val="56"/>
+    </w:rPr>
+  </w:style>
+  <w:style w:type="paragraph" w:customStyle="1" w:styleId="Strong1">
+    <w:name w:val="Strong1"/>
     <w:qFormat/>
     <w:rPr>
       <w:b/>
@@ -2234,12 +2939,10 @@
   </w:style>
   <w:style w:type="paragraph" w:styleId="ListParagraph">
     <w:name w:val="List Paragraph"/>
-    <w:basedOn w:val="Normal"/>
     <w:qFormat/>
   </w:style>
   <w:style w:type="character" w:styleId="Hyperlink">
     <w:name w:val="Hyperlink"/>
-    <w:basedOn w:val="DefaultParagraphFont"/>
     <w:uiPriority w:val="99"/>
     <w:unhideWhenUsed/>
     <w:rPr>
@@ -2249,7 +2952,6 @@
   </w:style>
   <w:style w:type="character" w:styleId="FootnoteReference">
     <w:name w:val="footnote reference"/>
-    <w:basedOn w:val="DefaultParagraphFont"/>
     <w:uiPriority w:val="99"/>
     <w:semiHidden/>
     <w:unhideWhenUsed/>
@@ -2259,22 +2961,17 @@
   </w:style>
   <w:style w:type="paragraph" w:styleId="FootnoteText">
     <w:name w:val="footnote text"/>
-    <w:basedOn w:val="Normal"/>
     <w:link w:val="FootnoteTextChar"/>
     <w:uiPriority w:val="99"/>
     <w:semiHidden/>
     <w:unhideWhenUsed/>
-    <w:pPr>
-      <w:spacing w:after="0" w:line="240" w:lineRule="auto"/>
-    </w:pPr>
     <w:rPr>
       <w:sz w:val="20"/>
       <w:szCs w:val="20"/>
     </w:rPr>
   </w:style>
-  <w:style w:type="character" w:styleId="FootnoteTextChar">
+  <w:style w:type="character" w:customStyle="1" w:styleId="FootnoteTextChar">
     <w:name w:val="Footnote Text Char"/>
-    <w:basedOn w:val="DefaultParagraphFont"/>
     <w:link w:val="FootnoteText"/>
     <w:uiPriority w:val="99"/>
     <w:semiHidden/>
@@ -2286,7 +2983,6 @@
   </w:style>
   <w:style w:type="character" w:styleId="EndnoteReference">
     <w:name w:val="endnote reference"/>
-    <w:basedOn w:val="DefaultParagraphFont"/>
     <w:uiPriority w:val="99"/>
     <w:semiHidden/>
     <w:unhideWhenUsed/>
@@ -2296,22 +2992,17 @@
   </w:style>
   <w:style w:type="paragraph" w:styleId="EndnoteText">
     <w:name w:val="endnote text"/>
-    <w:basedOn w:val="Normal"/>
     <w:link w:val="EndnoteTextChar"/>
     <w:uiPriority w:val="99"/>
     <w:semiHidden/>
     <w:unhideWhenUsed/>
-    <w:pPr>
-      <w:spacing w:after="0" w:line="240" w:lineRule="auto"/>
-    </w:pPr>
     <w:rPr>
       <w:sz w:val="20"/>
       <w:szCs w:val="20"/>
     </w:rPr>
   </w:style>
-  <w:style w:type="character" w:styleId="EndnoteTextChar">
+  <w:style w:type="character" w:customStyle="1" w:styleId="EndnoteTextChar">
     <w:name w:val="Endnote Text Char"/>
-    <w:basedOn w:val="DefaultParagraphFont"/>
     <w:link w:val="EndnoteText"/>
     <w:uiPriority w:val="99"/>
     <w:semiHidden/>
@@ -2321,41 +3012,320 @@
       <w:szCs w:val="20"/>
     </w:rPr>
   </w:style>
-  <w:style w:type="paragraph" w:styleId="Heading1">
-    <w:name w:val="Heading 1"/>
-    <w:basedOn w:val="Normal"/>
-    <w:next w:val="Normal"/>
-    <w:qFormat/>
-    <w:pPr>
-      <w:spacing w:after="160" w:before="200"/>
-      <w:outlineLvl w:val="0"/>
-    </w:pPr>
-    <w:rPr>
-      <w:rFonts w:ascii="Arial" w:cs="Arial" w:eastAsia="Arial" w:hAnsi="Arial"/>
-      <w:b/>
-      <w:bCs/>
-      <w:color w:val="1F7A4D"/>
-      <w:sz w:val="32"/>
-      <w:szCs w:val="32"/>
-    </w:rPr>
-  </w:style>
-  <w:style w:type="paragraph" w:styleId="Heading2">
-    <w:name w:val="Heading 2"/>
-    <w:basedOn w:val="Normal"/>
-    <w:next w:val="Normal"/>
-    <w:qFormat/>
-    <w:pPr>
-      <w:spacing w:after="120" w:before="160"/>
-      <w:outlineLvl w:val="1"/>
-    </w:pPr>
-    <w:rPr>
-      <w:rFonts w:ascii="Arial" w:cs="Arial" w:eastAsia="Arial" w:hAnsi="Arial"/>
-      <w:b/>
-      <w:bCs/>
-      <w:color w:val="C2410C"/>
-      <w:sz w:val="26"/>
-      <w:szCs w:val="26"/>
-    </w:rPr>
-  </w:style>
 </w:styles>
+</file>
+
+<file path=word/theme/theme1.xml><?xml version="1.0" encoding="utf-8"?>
+<a:theme xmlns:a="http://schemas.openxmlformats.org/drawingml/2006/main" name="Office Theme">
+  <a:themeElements>
+    <a:clrScheme name="Office">
+      <a:dk1>
+        <a:sysClr val="windowText" lastClr="000000"/>
+      </a:dk1>
+      <a:lt1>
+        <a:sysClr val="window" lastClr="FFFFFF"/>
+      </a:lt1>
+      <a:dk2>
+        <a:srgbClr val="0E2841"/>
+      </a:dk2>
+      <a:lt2>
+        <a:srgbClr val="E8E8E8"/>
+      </a:lt2>
+      <a:accent1>
+        <a:srgbClr val="156082"/>
+      </a:accent1>
+      <a:accent2>
+        <a:srgbClr val="E97132"/>
+      </a:accent2>
+      <a:accent3>
+        <a:srgbClr val="196B24"/>
+      </a:accent3>
+      <a:accent4>
+        <a:srgbClr val="0F9ED5"/>
+      </a:accent4>
+      <a:accent5>
+        <a:srgbClr val="A02B93"/>
+      </a:accent5>
+      <a:accent6>
+        <a:srgbClr val="4EA72E"/>
+      </a:accent6>
+      <a:hlink>
+        <a:srgbClr val="467886"/>
+      </a:hlink>
+      <a:folHlink>
+        <a:srgbClr val="96607D"/>
+      </a:folHlink>
+    </a:clrScheme>
+    <a:fontScheme name="Office">
+      <a:majorFont>
+        <a:latin typeface="Aptos Display" panose="02110004020202020204"/>
+        <a:ea typeface=""/>
+        <a:cs typeface=""/>
+        <a:font script="Jpan" typeface="游ゴシック Light"/>
+        <a:font script="Hang" typeface="맑은 고딕"/>
+        <a:font script="Hans" typeface="等线 Light"/>
+        <a:font script="Hant" typeface="新細明體"/>
+        <a:font script="Arab" typeface="Times New Roman"/>
+        <a:font script="Hebr" typeface="Times New Roman"/>
+        <a:font script="Thai" typeface="Angsana New"/>
+        <a:font script="Ethi" typeface="Nyala"/>
+        <a:font script="Beng" typeface="Vrinda"/>
+        <a:font script="Gujr" typeface="Shruti"/>
+        <a:font script="Khmr" typeface="MoolBoran"/>
+        <a:font script="Knda" typeface="Tunga"/>
+        <a:font script="Guru" typeface="Raavi"/>
+        <a:font script="Cans" typeface="Euphemia"/>
+        <a:font script="Cher" typeface="Plantagenet Cherokee"/>
+        <a:font script="Yiii" typeface="Microsoft Yi Baiti"/>
+        <a:font script="Tibt" typeface="Microsoft Himalaya"/>
+        <a:font script="Thaa" typeface="MV Boli"/>
+        <a:font script="Deva" typeface="Mangal"/>
+        <a:font script="Telu" typeface="Gautami"/>
+        <a:font script="Taml" typeface="Latha"/>
+        <a:font script="Syrc" typeface="Estrangelo Edessa"/>
+        <a:font script="Orya" typeface="Kalinga"/>
+        <a:font script="Mlym" typeface="Kartika"/>
+        <a:font script="Laoo" typeface="DokChampa"/>
+        <a:font script="Sinh" typeface="Iskoola Pota"/>
+        <a:font script="Mong" typeface="Mongolian Baiti"/>
+        <a:font script="Viet" typeface="Times New Roman"/>
+        <a:font script="Uigh" typeface="Microsoft Uighur"/>
+        <a:font script="Geor" typeface="Sylfaen"/>
+        <a:font script="Armn" typeface="Arial"/>
+        <a:font script="Bugi" typeface="Leelawadee UI"/>
+        <a:font script="Bopo" typeface="Microsoft JhengHei"/>
+        <a:font script="Java" typeface="Javanese Text"/>
+        <a:font script="Lisu" typeface="Segoe UI"/>
+        <a:font script="Mymr" typeface="Myanmar Text"/>
+        <a:font script="Nkoo" typeface="Ebrima"/>
+        <a:font script="Olck" typeface="Nirmala UI"/>
+        <a:font script="Osma" typeface="Ebrima"/>
+        <a:font script="Phag" typeface="Phagspa"/>
+        <a:font script="Syrn" typeface="Estrangelo Edessa"/>
+        <a:font script="Syrj" typeface="Estrangelo Edessa"/>
+        <a:font script="Syre" typeface="Estrangelo Edessa"/>
+        <a:font script="Sora" typeface="Nirmala UI"/>
+        <a:font script="Tale" typeface="Microsoft Tai Le"/>
+        <a:font script="Talu" typeface="Microsoft New Tai Lue"/>
+        <a:font script="Tfng" typeface="Ebrima"/>
+      </a:majorFont>
+      <a:minorFont>
+        <a:latin typeface="Aptos" panose="02110004020202020204"/>
+        <a:ea typeface=""/>
+        <a:cs typeface=""/>
+        <a:font script="Jpan" typeface="游明朝"/>
+        <a:font script="Hang" typeface="맑은 고딕"/>
+        <a:font script="Hans" typeface="等线"/>
+        <a:font script="Hant" typeface="新細明體"/>
+        <a:font script="Arab" typeface="Arial"/>
+        <a:font script="Hebr" typeface="Arial"/>
+        <a:font script="Thai" typeface="Cordia New"/>
+        <a:font script="Ethi" typeface="Nyala"/>
+        <a:font script="Beng" typeface="Vrinda"/>
+        <a:font script="Gujr" typeface="Shruti"/>
+        <a:font script="Khmr" typeface="DaunPenh"/>
+        <a:font script="Knda" typeface="Tunga"/>
+        <a:font script="Guru" typeface="Raavi"/>
+        <a:font script="Cans" typeface="Euphemia"/>
+        <a:font script="Cher" typeface="Plantagenet Cherokee"/>
+        <a:font script="Yiii" typeface="Microsoft Yi Baiti"/>
+        <a:font script="Tibt" typeface="Microsoft Himalaya"/>
+        <a:font script="Thaa" typeface="MV Boli"/>
+        <a:font script="Deva" typeface="Mangal"/>
+        <a:font script="Telu" typeface="Gautami"/>
+        <a:font script="Taml" typeface="Latha"/>
+        <a:font script="Syrc" typeface="Estrangelo Edessa"/>
+        <a:font script="Orya" typeface="Kalinga"/>
+        <a:font script="Mlym" typeface="Kartika"/>
+        <a:font script="Laoo" typeface="DokChampa"/>
+        <a:font script="Sinh" typeface="Iskoola Pota"/>
+        <a:font script="Mong" typeface="Mongolian Baiti"/>
+        <a:font script="Viet" typeface="Arial"/>
+        <a:font script="Uigh" typeface="Microsoft Uighur"/>
+        <a:font script="Geor" typeface="Sylfaen"/>
+        <a:font script="Armn" typeface="Arial"/>
+        <a:font script="Bugi" typeface="Leelawadee UI"/>
+        <a:font script="Bopo" typeface="Microsoft JhengHei"/>
+        <a:font script="Java" typeface="Javanese Text"/>
+        <a:font script="Lisu" typeface="Segoe UI"/>
+        <a:font script="Mymr" typeface="Myanmar Text"/>
+        <a:font script="Nkoo" typeface="Ebrima"/>
+        <a:font script="Olck" typeface="Nirmala UI"/>
+        <a:font script="Osma" typeface="Ebrima"/>
+        <a:font script="Phag" typeface="Phagspa"/>
+        <a:font script="Syrn" typeface="Estrangelo Edessa"/>
+        <a:font script="Syrj" typeface="Estrangelo Edessa"/>
+        <a:font script="Syre" typeface="Estrangelo Edessa"/>
+        <a:font script="Sora" typeface="Nirmala UI"/>
+        <a:font script="Tale" typeface="Microsoft Tai Le"/>
+        <a:font script="Talu" typeface="Microsoft New Tai Lue"/>
+        <a:font script="Tfng" typeface="Ebrima"/>
+      </a:minorFont>
+    </a:fontScheme>
+    <a:fmtScheme name="Office">
+      <a:fillStyleLst>
+        <a:solidFill>
+          <a:schemeClr val="phClr"/>
+        </a:solidFill>
+        <a:gradFill rotWithShape="1">
+          <a:gsLst>
+            <a:gs pos="0">
+              <a:schemeClr val="phClr">
+                <a:lumMod val="110000"/>
+                <a:satMod val="105000"/>
+                <a:tint val="67000"/>
+              </a:schemeClr>
+            </a:gs>
+            <a:gs pos="50000">
+              <a:schemeClr val="phClr">
+                <a:lumMod val="105000"/>
+                <a:satMod val="103000"/>
+                <a:tint val="73000"/>
+              </a:schemeClr>
+            </a:gs>
+            <a:gs pos="100000">
+              <a:schemeClr val="phClr">
+                <a:lumMod val="105000"/>
+                <a:satMod val="109000"/>
+                <a:tint val="81000"/>
+              </a:schemeClr>
+            </a:gs>
+          </a:gsLst>
+          <a:lin ang="5400000" scaled="0"/>
+        </a:gradFill>
+        <a:gradFill rotWithShape="1">
+          <a:gsLst>
+            <a:gs pos="0">
+              <a:schemeClr val="phClr">
+                <a:satMod val="103000"/>
+                <a:lumMod val="102000"/>
+                <a:tint val="94000"/>
+              </a:schemeClr>
+            </a:gs>
+            <a:gs pos="50000">
+              <a:schemeClr val="phClr">
+                <a:satMod val="110000"/>
+                <a:lumMod val="100000"/>
+                <a:shade val="100000"/>
+              </a:schemeClr>
+            </a:gs>
+            <a:gs pos="100000">
+              <a:schemeClr val="phClr">
+                <a:lumMod val="99000"/>
+                <a:satMod val="120000"/>
+                <a:shade val="78000"/>
+              </a:schemeClr>
+            </a:gs>
+          </a:gsLst>
+          <a:lin ang="5400000" scaled="0"/>
+        </a:gradFill>
+      </a:fillStyleLst>
+      <a:lnStyleLst>
+        <a:ln w="12700" cap="flat" cmpd="sng" algn="ctr">
+          <a:solidFill>
+            <a:schemeClr val="phClr"/>
+          </a:solidFill>
+          <a:prstDash val="solid"/>
+          <a:miter lim="800000"/>
+        </a:ln>
+        <a:ln w="19050" cap="flat" cmpd="sng" algn="ctr">
+          <a:solidFill>
+            <a:schemeClr val="phClr"/>
+          </a:solidFill>
+          <a:prstDash val="solid"/>
+          <a:miter lim="800000"/>
+        </a:ln>
+        <a:ln w="25400" cap="flat" cmpd="sng" algn="ctr">
+          <a:solidFill>
+            <a:schemeClr val="phClr"/>
+          </a:solidFill>
+          <a:prstDash val="solid"/>
+          <a:miter lim="800000"/>
+        </a:ln>
+      </a:lnStyleLst>
+      <a:effectStyleLst>
+        <a:effectStyle>
+          <a:effectLst/>
+        </a:effectStyle>
+        <a:effectStyle>
+          <a:effectLst/>
+        </a:effectStyle>
+        <a:effectStyle>
+          <a:effectLst>
+            <a:outerShdw blurRad="57150" dist="19050" dir="5400000" algn="ctr" rotWithShape="0">
+              <a:srgbClr val="000000">
+                <a:alpha val="63000"/>
+              </a:srgbClr>
+            </a:outerShdw>
+          </a:effectLst>
+        </a:effectStyle>
+      </a:effectStyleLst>
+      <a:bgFillStyleLst>
+        <a:solidFill>
+          <a:schemeClr val="phClr"/>
+        </a:solidFill>
+        <a:solidFill>
+          <a:schemeClr val="phClr">
+            <a:tint val="95000"/>
+            <a:satMod val="170000"/>
+          </a:schemeClr>
+        </a:solidFill>
+        <a:gradFill rotWithShape="1">
+          <a:gsLst>
+            <a:gs pos="0">
+              <a:schemeClr val="phClr">
+                <a:tint val="93000"/>
+                <a:satMod val="150000"/>
+                <a:shade val="98000"/>
+                <a:lumMod val="102000"/>
+              </a:schemeClr>
+            </a:gs>
+            <a:gs pos="50000">
+              <a:schemeClr val="phClr">
+                <a:tint val="98000"/>
+                <a:satMod val="130000"/>
+                <a:shade val="90000"/>
+                <a:lumMod val="103000"/>
+              </a:schemeClr>
+            </a:gs>
+            <a:gs pos="100000">
+              <a:schemeClr val="phClr">
+                <a:shade val="63000"/>
+                <a:satMod val="120000"/>
+              </a:schemeClr>
+            </a:gs>
+          </a:gsLst>
+          <a:lin ang="5400000" scaled="0"/>
+        </a:gradFill>
+      </a:bgFillStyleLst>
+    </a:fmtScheme>
+  </a:themeElements>
+  <a:objectDefaults>
+    <a:lnDef>
+      <a:spPr/>
+      <a:bodyPr/>
+      <a:lstStyle/>
+      <a:style>
+        <a:lnRef idx="2">
+          <a:schemeClr val="accent1"/>
+        </a:lnRef>
+        <a:fillRef idx="0">
+          <a:schemeClr val="accent1"/>
+        </a:fillRef>
+        <a:effectRef idx="1">
+          <a:schemeClr val="accent1"/>
+        </a:effectRef>
+        <a:fontRef idx="minor">
+          <a:schemeClr val="tx1"/>
+        </a:fontRef>
+      </a:style>
+    </a:lnDef>
+  </a:objectDefaults>
+  <a:extraClrSchemeLst/>
+  <a:extLst>
+    <a:ext uri="{05A4C25C-085E-4340-85A3-A5531E510DB2}">
+      <thm15:themeFamily xmlns:thm15="http://schemas.microsoft.com/office/thememl/2012/main" name="Office Theme" id="{2E142A2C-CD16-42D6-873A-C26D2A0506FA}" vid="{1BDDFF52-6CD6-40A5-AB3C-68EB2F1E4D0A}"/>
+    </a:ext>
+  </a:extLst>
+</a:theme>
 </file>
</xml_diff>

<commit_message>
docs(huong-dan): clarify signed-undelivered stock is recorded outside inventory
Co-Authored-By: Claude Opus 4.8 <noreply@anthropic.com>
</commit_message>
<xml_diff>
--- a/docs/huong-dan/nhap-lieu-bang-excel/Huong-dan-nhap-lieu-bang-Excel.docx
+++ b/docs/huong-dan/nhap-lieu-bang-excel/Huong-dan-nhap-lieu-bang-Excel.docx
@@ -16,7 +16,7 @@
         <w:spacing w:after="200"/>
       </w:pPr>
       <w:r>
-        <w:t xml:space="preserve">Thay vì gõ tay từng ngày trên web, có thể tải file Excel mẫu về điền rồi nhập lên. Tài liệu này mô tả ba biểu mẫu — Thu mua, Tiêu thụ, Tồn kho — kèm ý nghĩa từng cột và cách xử lý dòng lỗi. Ba file mẫu đính kèm trong thư mục 'mau'. Tài liệu bám theo phiên bản 0.2.78.</w:t>
+        <w:t xml:space="preserve">Thay vì gõ tay từng ngày trên web, có thể tải file Excel mẫu về điền rồi nhập lên. Tài liệu này mô tả ba biểu mẫu — Thu mua, Tiêu thụ, Tồn kho — kèm ý nghĩa từng cột và cách xử lý dòng lỗi. Ba file mẫu đính kèm trong thư mục 'mau'. Tài liệu bám theo phiên bản 0.2.79.</w:t>
       </w:r>
     </w:p>
     <w:p>
@@ -1572,7 +1572,7 @@
         <w:t xml:space="preserve">một lần</w:t>
       </w:r>
       <w:r>
-        <w:t xml:space="preserve">, hệ thống tự tính vào tồn kho **từ cột *Ngày* (= ngày bắt đầu tồn kho) đến hết ngày TRƯỚC *Ngày giao*</w:t>
+        <w:t xml:space="preserve">, hệ thống tự giữ ở nhóm này **từ cột *Ngày* (= ngày bắt đầu tồn kho) đến hết ngày TRƯỚC *Ngày giao*</w:t>
       </w:r>
       <w:r>
         <w:rPr>
@@ -1582,7 +1582,27 @@
         <w:t xml:space="preserve">. </w:t>
       </w:r>
       <w:r>
-        <w:t xml:space="preserve">KHÔNG nhập lại hợp đồng đó cho các ngày sau.**</w:t>
+        <w:t xml:space="preserve">KHÔNG nhập lại hợp đồng đó cho các ngày sau.</w:t>
+      </w:r>
+      <w:r>
+        <w:rPr>
+          <w:b/>
+          <w:bCs/>
+        </w:rPr>
+        <w:t xml:space="preserve"> Nhóm này chỉ để </w:t>
+      </w:r>
+      <w:r>
+        <w:t xml:space="preserve">ghi nhận</w:t>
+      </w:r>
+      <w:r>
+        <w:rPr>
+          <w:b/>
+          <w:bCs/>
+        </w:rPr>
+        <w:t xml:space="preserve"> số đã ký mà chưa giao — </w:t>
+      </w:r>
+      <w:r>
+        <w:t xml:space="preserve">không cộng vào và không trừ khỏi** tồn kho thành phẩm.</w:t>
       </w:r>
     </w:p>
     <w:p>
@@ -1832,7 +1852,7 @@
         <w:t xml:space="preserve">chưa giao thì để trống</w:t>
       </w:r>
       <w:r>
-        <w:t xml:space="preserve">. Điền ngày này là hợp đồng thôi tính vào tồn kho kể từ ngày đó.</w:t>
+        <w:t xml:space="preserve">. Điền ngày này là hợp đồng thôi nằm ở nhóm *Đã ký HĐ* kể từ ngày đó.</w:t>
       </w:r>
     </w:p>
     <w:p>

</xml_diff>

<commit_message>
fix(unit-daily): describe signed-undelivered stock as part of finished stock
Ban TTKD confirmed the block counts how much of the finished stock is already
under contract but not yet delivered — a subset, not a separate commitment
sitting outside inventory. The totals were already right (it is neither added
nor subtracted), but every label said the opposite, and the guides told units
that signing more than they hold was fine.

The stock summary now flags the impossible case where the signed figure exceeds
finished stock.
</commit_message>
<xml_diff>
--- a/docs/huong-dan/nhap-lieu-bang-excel/Huong-dan-nhap-lieu-bang-Excel.docx
+++ b/docs/huong-dan/nhap-lieu-bang-excel/Huong-dan-nhap-lieu-bang-Excel.docx
@@ -1589,20 +1589,30 @@
           <w:b/>
           <w:bCs/>
         </w:rPr>
-        <w:t xml:space="preserve"> Nhóm này chỉ để </w:t>
-      </w:r>
-      <w:r>
-        <w:t xml:space="preserve">ghi nhận</w:t>
-      </w:r>
-      <w:r>
-        <w:rPr>
-          <w:b/>
-          <w:bCs/>
-        </w:rPr>
-        <w:t xml:space="preserve"> số đã ký mà chưa giao — </w:t>
-      </w:r>
-      <w:r>
-        <w:t xml:space="preserve">không cộng vào và không trừ khỏi** tồn kho thành phẩm.</w:t>
+        <w:t xml:space="preserve"> Nhóm này là </w:t>
+      </w:r>
+      <w:r>
+        <w:t xml:space="preserve">phần NẰM TRONG tồn kho thành phẩm</w:t>
+      </w:r>
+      <w:r>
+        <w:rPr>
+          <w:b/>
+          <w:bCs/>
+        </w:rPr>
+        <w:t xml:space="preserve"> đã có hợp đồng nhưng chưa giao — chỉ để biết trong tồn kho bao nhiêu đã có đầu ra, nên </w:t>
+      </w:r>
+      <w:r>
+        <w:t xml:space="preserve">không cộng thêm</w:t>
+      </w:r>
+      <w:r>
+        <w:rPr>
+          <w:b/>
+          <w:bCs/>
+        </w:rPr>
+        <w:t xml:space="preserve"> vào tồn kho (cộng nữa là tính trùng) và cũng </w:t>
+      </w:r>
+      <w:r>
+        <w:t xml:space="preserve">không trừ ra**.</w:t>
       </w:r>
     </w:p>
     <w:p>
@@ -1950,10 +1960,20 @@
           <w:b/>
           <w:bCs/>
         </w:rPr>
-        <w:t xml:space="preserve">cam kết giao hàng</w:t>
-      </w:r>
-      <w:r>
-        <w:t xml:space="preserve">, đứng riêng — không cộng vào và không trừ khỏi tồn kho thành phẩm, nên ký nhiều hơn lượng đang có cũng không sao.</w:t>
+        <w:t xml:space="preserve">phần đã có hợp đồng nằm trong</w:t>
+      </w:r>
+      <w:r>
+        <w:t xml:space="preserve"> tồn kho thành phẩm — không cộng thêm và không trừ ra, và </w:t>
+      </w:r>
+      <w:r>
+        <w:rPr>
+          <w:b/>
+          <w:bCs/>
+        </w:rPr>
+        <w:t xml:space="preserve">không vượt quá</w:t>
+      </w:r>
+      <w:r>
+        <w:t xml:space="preserve"> tổng tồn kho thành phẩm của đơn vị.</w:t>
       </w:r>
     </w:p>
     <w:p>

</xml_diff>

<commit_message>
docs(huong-dan): describe the system as it is now, drop change notes
The guides have never been handed out, so lines telling readers what moved,
what was dropped and which columns are new describe a history nobody has. They
now state the current forms directly, and the attachment sections list the
formats the system actually accepts, the 25 MB limit and the one-file-per-slot
rule.

Also removes the version stamp: it said 0.2.79 while production ran 0.2.81, and
keeping it in sync means editing four files on every release.
</commit_message>
<xml_diff>
--- a/docs/huong-dan/nhap-lieu-bang-excel/Huong-dan-nhap-lieu-bang-Excel.docx
+++ b/docs/huong-dan/nhap-lieu-bang-excel/Huong-dan-nhap-lieu-bang-Excel.docx
@@ -16,7 +16,7 @@
         <w:spacing w:after="200"/>
       </w:pPr>
       <w:r>
-        <w:t xml:space="preserve">Thay vì gõ tay từng ngày trên web, có thể tải file Excel mẫu về điền rồi nhập lên. Tài liệu này mô tả ba biểu mẫu — Thu mua, Tiêu thụ, Tồn kho — kèm ý nghĩa từng cột và cách xử lý dòng lỗi. Ba file mẫu đính kèm trong thư mục 'mau'. Tài liệu bám theo phiên bản 0.2.79.</w:t>
+        <w:t xml:space="preserve">Thay vì gõ tay từng ngày trên web, có thể tải file Excel mẫu về điền rồi nhập lên. Tài liệu này mô tả ba biểu mẫu — Thu mua, Tiêu thụ, Tồn kho — kèm ý nghĩa từng cột và cách xử lý dòng lỗi. Ba file mẫu đính kèm trong thư mục 'mau'.</w:t>
       </w:r>
     </w:p>
     <w:p>
@@ -246,10 +246,10 @@
           <w:b/>
           <w:bCs/>
         </w:rPr>
-        <w:t xml:space="preserve">Đừng dùng lại file tải từ lần trước</w:t>
-      </w:r>
-      <w:r>
-        <w:t xml:space="preserve"> — mẫu có thể đã thêm cột; file cũ thiếu cột sẽ nhập thiếu số mà không báo gì.</w:t>
+        <w:t xml:space="preserve">Luôn tải mẫu mới trước mỗi lần nhập</w:t>
+      </w:r>
+      <w:r>
+        <w:t xml:space="preserve"> — file đang giữ trong máy có thể khác cột với mẫu hiện hành, thiếu cột sẽ nhập thiếu số mà không báo gì.</w:t>
       </w:r>
     </w:p>
     <w:p>
@@ -1108,29 +1108,6 @@
       </w:r>
       <w:r>
         <w:t xml:space="preserve"> thì không nhập bằng Excel — vào form trên web tích ô 'Hôm nay đơn vị KHÔNG tổ chức thu mua', vì đó là tình huống khác với 'có mua nhưng mua được 0 tấn'.</w:t>
-      </w:r>
-    </w:p>
-    <w:p>
-      <w:pPr>
-        <w:pStyle w:val="ListParagraph"/>
-        <w:numPr>
-          <w:ilvl w:val="0"/>
-          <w:numId w:val="3"/>
-        </w:numPr>
-        <w:spacing w:after="80"/>
-      </w:pPr>
-      <w:r>
-        <w:t xml:space="preserve">Sản lượng tiêu thụ và doanh thu </w:t>
-      </w:r>
-      <w:r>
-        <w:rPr>
-          <w:b/>
-          <w:bCs/>
-        </w:rPr>
-        <w:t xml:space="preserve">không còn ở biểu Thu mua</w:t>
-      </w:r>
-      <w:r>
-        <w:t xml:space="preserve"> — đã chuyển sang biểu Tiêu thụ.</w:t>
       </w:r>
     </w:p>
     <w:p>

</xml_diff>

<commit_message>
docs(huong-dan): describe the 11:00 data entry deadline
</commit_message>
<xml_diff>
--- a/docs/huong-dan/nhap-lieu-bang-excel/Huong-dan-nhap-lieu-bang-Excel.docx
+++ b/docs/huong-dan/nhap-lieu-bang-excel/Huong-dan-nhap-lieu-bang-Excel.docx
@@ -2153,7 +2153,17 @@
         <w:spacing w:after="80"/>
       </w:pPr>
       <w:r>
-        <w:t xml:space="preserve">Chỉ nhập được ngày hôm nay và một số ngày gần nhất theo quy định; ngày cũ hơn hệ thống sẽ từ chối ghi.</w:t>
+        <w:t xml:space="preserve">Số liệu mỗi ngày chỉ nhập được đến </w:t>
+      </w:r>
+      <w:r>
+        <w:rPr>
+          <w:b/>
+          <w:bCs/>
+        </w:rPr>
+        <w:t xml:space="preserve">11:00</w:t>
+      </w:r>
+      <w:r>
+        <w:t xml:space="preserve"> theo hạn quy định (ví dụ: đến 11:00 ngày hôm sau); ngày đã quá hạn hệ thống sẽ từ chối ghi.</w:t>
       </w:r>
     </w:p>
     <w:p>

</xml_diff>